<commit_message>
fix(paper): correct robustness, bimodality and real-data statements
ITEST 10-page docx and Ukrainian draft:
- robustness table/text/conclusions use the real PMM3 results
  (ARE 2.685 / 1.061 / 1.023 / 1.047 instead of the stub's 1.000);
  bimodal test is M = 200, bias < 0.003
- bimodality boundary lambda > 1 (was 1/sqrt(2)), incl. intro equation
  and Fig. 1 caption
- iris g3 theor = 0.483 (0.517 is the reduction)
- five further datasets: g3 emp in [1.03, 1.36], not [0.97, 1.03]
- figures re-inserted from the R pipeline
Still 10 pages with unchanged pagination (LibreOffice render).

Co-Authored-By: Claude Opus 5 (1M context) <noreply@anthropic.com>
</commit_message>
<xml_diff>
--- a/submission/SZabolotnii_ITEST_paper_10p.docx
+++ b/submission/SZabolotnii_ITEST_paper_10p.docx
@@ -7,34 +7,7 @@
         <w:pStyle w:val="papertitle"/>
       </w:pPr>
       <w:r>
-        <w:t xml:space="preserve">PMM3 vs MLE-TN: Comparison of </w:t>
-      </w:r>
-      <w:r>
-        <w:t xml:space="preserve">Semiparametric </w:t>
-      </w:r>
-      <w:r>
-        <w:t xml:space="preserve">and </w:t>
-      </w:r>
-      <w:r>
-        <w:t xml:space="preserve">Parametric Estimation </w:t>
-      </w:r>
-      <w:r>
-        <w:t xml:space="preserve">of </w:t>
-      </w:r>
-      <w:r>
-        <w:t xml:space="preserve">Linear Regression Parameters </w:t>
-      </w:r>
-      <w:r>
-        <w:t xml:space="preserve">under </w:t>
-      </w:r>
-      <w:r>
-        <w:t>Two</w:t>
-      </w:r>
-      <w:r>
-        <w:t xml:space="preserve">-piece </w:t>
-      </w:r>
-      <w:r>
-        <w:t>Normal Distributed Errors</w:t>
+        <w:t xml:space="preserve">PMM3 vs MLE-TN: Comparison of Semiparametric and Parametric Estimation of Linear Regression Parameters under Two-piece Normal Distributed Errors</w:t>
       </w:r>
     </w:p>
     <w:p>
@@ -101,22 +74,7 @@
         <w:t>1</w:t>
       </w:r>
       <w:r>
-        <w:t xml:space="preserve"> </w:t>
-      </w:r>
-      <w:r>
-        <w:t>Cherkasy State Business College</w:t>
-      </w:r>
-      <w:r>
-        <w:t xml:space="preserve">, </w:t>
-      </w:r>
-      <w:r>
-        <w:t>Cherkasy</w:t>
-      </w:r>
-      <w:r>
-        <w:t>, U</w:t>
-      </w:r>
-      <w:r>
-        <w:t>kraine</w:t>
+        <w:t xml:space="preserve"> Cherkasy State Business College, Cherkasy, Ukraine</w:t>
       </w:r>
     </w:p>
     <w:p>
@@ -130,12 +88,7 @@
         <w:t>2</w:t>
       </w:r>
       <w:r>
-        <w:t xml:space="preserve"> </w:t>
-      </w:r>
-      <w:r>
-        <w:t>Cherkasy State Technological University, Cherkasy, Ukraine</w:t>
-      </w:r>
-      <w:r>
+        <w:t xml:space="preserve"> Cherkasy State Technological University, Cherkasy, Ukraine</w:t>
         <w:br/>
       </w:r>
       <w:r>
@@ -158,13 +111,7 @@
         <w:t xml:space="preserve">Abstract. </w:t>
       </w:r>
       <w:r>
-        <w:t>This paper addresses the problem of estimating the parameter vector of a linear regression model under symmetric non-Gaussian errors following a Two-piece Normal (TN) distribution. Three methods are compared: Ordinary Least Squares (OLS), Maximum Likelihood Estimation for the TN distribution (MLE-TN), and the third-</w:t>
-      </w:r>
-      <w:r>
-        <w:t>power</w:t>
-      </w:r>
-      <w:r>
-        <w:t xml:space="preserve"> Polynomial Maximization Method (PMM3). MLE-TN is fully parametric; PMM3 is semiparametric, using only the 2nd, 4th and 6th-order moments. Theoretical analysis shows that PMM3 achieves up to a 95.5% variance reduction compared to OLS at </w:t>
+        <w:t xml:space="preserve">This paper addresses the problem of estimating the parameter vector of a linear regression model under symmetric non-Gaussian errors following a Two-piece Normal (TN) distribution. Three methods are compared: Ordinary Least Squares (OLS), Maximum Likelihood Estimation for the TN distribution (MLE-TN), and the third-power Polynomial Maximization Method (PMM3). MLE-TN is fully parametric; PMM3 is semiparametric, using only the 2nd, 4th and 6th-order moments. Theoretical analysis shows that PMM3 achieves up to a 95.5% variance reduction compared to OLS at </w:t>
       </w:r>
       <m:oMath>
         <m:r>
@@ -175,10 +122,7 @@
         </m:r>
       </m:oMath>
       <w:r>
-        <w:t xml:space="preserve"> </w:t>
-      </w:r>
-      <w:r>
-        <w:t xml:space="preserve">(the TN shape parameter), while MLE-TN provides up to a 28-fold advantage for large </w:t>
+        <w:t xml:space="preserve"> (the TN shape parameter), while MLE-TN provides up to a 28-fold advantage for large </w:t>
       </w:r>
       <m:oMath>
         <m:r>
@@ -200,10 +144,7 @@
         </m:r>
       </m:oMath>
       <w:r>
-        <w:t xml:space="preserve"> </w:t>
-      </w:r>
-      <w:r>
-        <w:t xml:space="preserve">converges to the theoretical value for </w:t>
+        <w:t xml:space="preserve"> converges to the theoretical value for </w:t>
       </w:r>
       <m:oMath>
         <m:r>
@@ -214,7 +155,7 @@
         </m:r>
       </m:oMath>
       <w:r>
-        <w:t>. PMM3 is shown to be robust under misspecification, whereas MLE-TN can be inefficient. On real-world data (</w:t>
+        <w:t>. Under misspecification PMM3 never falls below OLS (ARE from 1.02 to 2.68), whereas MLE-TN can be less efficient than OLS. On real-world data (</w:t>
       </w:r>
       <w:r>
         <w:rPr>
@@ -224,10 +165,7 @@
         <w:t>Iris versicolor</w:t>
       </w:r>
       <w:r>
-        <w:t>), PMM3 achieves a 43% bootstrap variance reduction and improves LOO-CV by 2.3% over OLS. An empirical efficiency threshold for PMM3 is established at</w:t>
-      </w:r>
-      <w:r>
-        <w:t xml:space="preserve"> </w:t>
+        <w:t xml:space="preserve">), PMM3 achieves a 43% bootstrap variance reduction and improves LOO-CV by 2.3% over OLS. An empirical efficiency threshold for PMM3 is established at </w:t>
       </w:r>
       <m:oMath>
         <m:sSub>
@@ -281,13 +219,7 @@
         <w:t>Keywords:</w:t>
       </w:r>
       <w:r>
-        <w:t xml:space="preserve"> </w:t>
-      </w:r>
-      <w:r>
-        <w:t>Polynomial Maximization Method, Linear Regression, Two-piece Normal distribution, Maximum Likelihood Estimation, Estimation Efficiency, Robustness, Monte Carlo</w:t>
-      </w:r>
-      <w:r>
-        <w:t>.</w:t>
+        <w:t xml:space="preserve"> Polynomial Maximization Method, Linear Regression, Two-piece Normal distribution, Maximum Likelihood Estimation, Estimation Efficiency, Robustness, Monte Carlo.</w:t>
       </w:r>
     </w:p>
     <w:p>
@@ -306,13 +238,7 @@
         <w:ind w:firstLine="0"/>
       </w:pPr>
       <w:r>
-        <w:t xml:space="preserve">The Ordinary Least Squares (OLS) method [5] is the Best Linear Unbiased Estimator under Gaussian errors, but its efficiency depends on the shape of the error distribution [2]. When </w:t>
-      </w:r>
-      <w:r>
-        <w:t>normality</w:t>
-      </w:r>
-      <w:r>
-        <w:t xml:space="preserve"> is violated, OLS loses its asymptotic optimality, whereas estimators exploiting higher-order moments may achieve lower variance.</w:t>
+        <w:t xml:space="preserve">The Ordinary Least Squares (OLS) method [5] is the Best Linear Unbiased Estimator under Gaussian errors, but its efficiency depends on the shape of the error distribution [2]. When normality is violated, OLS loses its asymptotic optimality, whereas estimators exploiting higher-order moments may achieve lower variance.</w:t>
       </w:r>
     </w:p>
     <w:p>
@@ -351,18 +277,13 @@
       </w:r>
       <w:r>
         <w:t xml:space="preserve">) commonly arise in measurements with a </w:t>
-      </w:r>
-      <w:r>
         <w:lastRenderedPageBreak/>
         <w:t>limited operating range, in regression residual histograms, and when multiple sources of uniformly distributed errors are aggregated.</w:t>
       </w:r>
     </w:p>
     <w:p>
       <w:r>
-        <w:t xml:space="preserve">One important family of such distributions is the Two-piece Normal (TN) distribution, introduced in [8] and further investigated in [14]. </w:t>
-      </w:r>
-      <w:r>
-        <w:t>The TN distribution covers a broad spectrum of symmetric shapes, ranging from an approximately Gaussian form at (</w:t>
+        <w:t xml:space="preserve">One important family of such distributions is the Two-piece Normal (TN) distribution, introduced in [8] and further investigated in [14]. The TN distribution covers a broad spectrum of symmetric shapes, ranging from an approximately Gaussian form at (</w:t>
       </w:r>
       <w:r>
         <w:rPr>
@@ -378,22 +299,16 @@
       <w:r>
         <w:t>) to a strongly bimodal form at (</w:t>
       </w:r>
-      <w:r>
-        <w:rPr>
-          <w:position w:val="-6"/>
-        </w:rPr>
-        <w:object w:dxaOrig="920" w:dyaOrig="240" w14:anchorId="4A355ED2">
-          <v:shape id="_x0000_i1027" type="#_x0000_t75" style="width:45.85pt;height:12pt" o:ole="">
-            <v:imagedata r:id="rId12" o:title=""/>
-          </v:shape>
-          <o:OLEObject Type="Embed" ProgID="Equation.DSMT4" ShapeID="_x0000_i1027" DrawAspect="Content" ObjectID="_1851358370" r:id="rId13"/>
-        </w:object>
-      </w:r>
-      <w:r>
-        <w:t>), making it a natural benchmark for studying symmetric platykurtic distributions with</w:t>
-      </w:r>
-      <w:r>
-        <w:t xml:space="preserve"> </w:t>
+      <m:oMath>
+        <m:r>
+          <w:rPr>
+            <w:rFonts w:ascii="Cambria Math" w:hAnsi="Cambria Math"/>
+          </w:rPr>
+          <m:t>λ≫1</m:t>
+        </m:r>
+      </m:oMath>
+      <w:r>
+        <w:t xml:space="preserve">), making it a natural benchmark for studying symmetric platykurtic distributions with </w:t>
       </w:r>
       <w:r>
         <w:rPr>
@@ -412,13 +327,7 @@
     </w:p>
     <w:p>
       <w:r>
-        <w:t>Three fundamentally different approaches can be distinguished:</w:t>
-      </w:r>
-      <w:r>
-        <w:t xml:space="preserve"> </w:t>
-      </w:r>
-      <w:r>
-        <w:t xml:space="preserve">Parametric approach (MLE-TN): jointly estimates all parameters </w:t>
+        <w:t xml:space="preserve">Three fundamentally different approaches can be distinguished: Parametric approach (MLE-TN): jointly estimates all parameters </w:t>
       </w:r>
       <m:oMath>
         <m:d>
@@ -457,49 +366,7 @@
         </m:d>
       </m:oMath>
       <w:r>
-        <w:t xml:space="preserve">, attains the Cramér–Rao lower bound under correct model specification, but is sensitive to model misspecification [6], [18]; </w:t>
-      </w:r>
-      <w:r>
-        <w:t xml:space="preserve"> </w:t>
-      </w:r>
-      <w:r>
-        <w:t xml:space="preserve">Semiparametric approach (PMM3): utilizes only the </w:t>
-      </w:r>
-      <w:r>
-        <w:t>2</w:t>
-      </w:r>
-      <w:r>
-        <w:t>-</w:t>
-      </w:r>
-      <w:r>
-        <w:t>nd</w:t>
-      </w:r>
-      <w:r>
-        <w:t xml:space="preserve">, </w:t>
-      </w:r>
-      <w:r>
-        <w:t>4-</w:t>
-      </w:r>
-      <w:r>
-        <w:t xml:space="preserve">th and </w:t>
-      </w:r>
-      <w:r>
-        <w:t>6-</w:t>
-      </w:r>
-      <w:r>
-        <w:t>th</w:t>
-      </w:r>
-      <w:r>
-        <w:t xml:space="preserve"> </w:t>
-      </w:r>
-      <w:r>
-        <w:t>order moments. It does not require knowledge of the functional form of the error distribution and remains robust under model misspecification;</w:t>
-      </w:r>
-      <w:r>
-        <w:t xml:space="preserve"> </w:t>
-      </w:r>
-      <w:r>
-        <w:t>Nonparametric and robust approaches: including Weighted Least Squares (WLS), Least Absolute Deviations (LAD) regression [13], quantile regression [9], and adaptive Maximum Likelihood Estimation [15].</w:t>
+        <w:t xml:space="preserve">, attains the Cramér–Rao lower bound under correct model specification, but is sensitive to model misspecification [6], [18];  Semiparametric approach (PMM3): utilizes only the 2-nd, 4-th and 6-th order moments. It does not require knowledge of the functional form of the error distribution and remains robust under model misspecification; Nonparametric and robust approaches: including Weighted Least Squares (WLS), Least Absolute Deviations (LAD) regression [13], quantile regression [9], and adaptive Maximum Likelihood Estimation [15].</w:t>
       </w:r>
     </w:p>
     <w:p>
@@ -510,19 +377,7 @@
         </w:rPr>
       </w:pPr>
       <w:r>
-        <w:t>The present study addresses the following practical question:</w:t>
-      </w:r>
-      <w:r>
-        <w:t xml:space="preserve"> </w:t>
-      </w:r>
-      <w:r>
-        <w:t xml:space="preserve">under </w:t>
-      </w:r>
-      <w:r>
-        <w:t>what conditions, and to what extent, does PMM3 outperform both MLE-TN and OLS</w:t>
-      </w:r>
-      <w:r>
-        <w:t>.</w:t>
+        <w:t xml:space="preserve">The present study addresses the following practical question: under what conditions, and to what extent, does PMM3 outperform both MLE-TN and OLS.</w:t>
       </w:r>
     </w:p>
     <w:p>
@@ -547,13 +402,7 @@
         </w:rPr>
       </w:pPr>
       <w:r>
-        <w:t xml:space="preserve">In [2], a general expression for the </w:t>
-      </w:r>
-      <w:r>
-        <w:t>asymptotic relative efficiency</w:t>
-      </w:r>
-      <w:r>
-        <w:t xml:space="preserve"> of OLS was derived in terms of the cumulants of the underlying distribution. Subsequently, [16] systematically investigated parameter estimation in linear regression models with symmetric non-Gaussian errors. The studies reported in [1] and [4] confirmed that, for </w:t>
+        <w:t xml:space="preserve">In [2], a general expression for the asymptotic relative efficiency of OLS was derived in terms of the cumulants of the underlying distribution. Subsequently, [16] systematically investigated parameter estimation in linear regression models with symmetric non-Gaussian errors. The studies reported in [1] and [4] confirmed that, for </w:t>
       </w:r>
       <m:oMath>
         <m:sSub>
@@ -590,10 +439,7 @@
         </m:r>
       </m:oMath>
       <w:r>
-        <w:t>, classical OLS may perform worse than the optimal estimator.</w:t>
-      </w:r>
-      <w:r>
-        <w:t xml:space="preserve"> </w:t>
+        <w:t xml:space="preserve">, classical OLS may perform worse than the optimal estimator. </w:t>
       </w:r>
       <w:r>
         <w:rPr>
@@ -679,27 +525,7 @@
         <w:rPr>
           <w:bCs/>
         </w:rPr>
-        <w:t xml:space="preserve">) distributions, none of the standard methods can be regarded as optimal. In [12], a semiparametric regression framework with an unspecified error distribution was developed and shown to outperform MLE when the assumption of normality is </w:t>
-      </w:r>
-      <w:proofErr w:type="spellStart"/>
-      <w:r>
-        <w:rPr>
-          <w:bCs/>
-        </w:rPr>
-        <w:t>misspecified</w:t>
-      </w:r>
-      <w:proofErr w:type="spellEnd"/>
-      <w:r>
-        <w:rPr>
-          <w:bCs/>
-        </w:rPr>
-        <w:t>.</w:t>
-      </w:r>
-      <w:r>
-        <w:rPr>
-          <w:bCs/>
-        </w:rPr>
-        <w:t xml:space="preserve"> </w:t>
+        <w:t xml:space="preserve">) distributions, none of the standard methods can be regarded as optimal. In [12], a semiparametric regression framework with an unspecified error distribution was developed and shown to outperform MLE when the assumption of normality is misspecified. </w:t>
       </w:r>
       <w:r>
         <w:rPr>
@@ -718,45 +544,7 @@
         <w:rPr>
           <w:bCs/>
         </w:rPr>
-        <w:t xml:space="preserve">As for the </w:t>
-      </w:r>
-      <w:r>
-        <w:rPr>
-          <w:bCs/>
-        </w:rPr>
-        <w:t>Polynomial Maximization Method (PMM)</w:t>
-      </w:r>
-      <w:r>
-        <w:rPr>
-          <w:bCs/>
-        </w:rPr>
-        <w:t>, it</w:t>
-      </w:r>
-      <w:r>
-        <w:rPr>
-          <w:bCs/>
-        </w:rPr>
-        <w:t xml:space="preserve"> was developed by </w:t>
-      </w:r>
-      <w:proofErr w:type="spellStart"/>
-      <w:r>
-        <w:rPr>
-          <w:bCs/>
-        </w:rPr>
-        <w:t>Kunchenko</w:t>
-      </w:r>
-      <w:proofErr w:type="spellEnd"/>
-      <w:r>
-        <w:rPr>
-          <w:bCs/>
-        </w:rPr>
-        <w:t xml:space="preserve"> and Lega [10]. </w:t>
-      </w:r>
-      <w:r>
-        <w:rPr>
-          <w:bCs/>
-        </w:rPr>
-        <w:t xml:space="preserve">The theoretical efficiency coefficient of PMM3 derived in [17] is given in Section 2.4.</w:t>
+        <w:t xml:space="preserve">As for the Polynomial Maximization Method (PMM), it was developed by Kunchenko and Lega [10]. The theoretical efficiency coefficient of PMM3 derived in [17] is given in Section 2.4.</w:t>
       </w:r>
     </w:p>
     <w:p>
@@ -901,123 +689,13 @@
         <w:rPr>
           <w:bCs/>
         </w:rPr>
-        <w:t>)</w:t>
-      </w:r>
-      <w:r>
-        <w:rPr>
-          <w:bCs/>
-        </w:rPr>
-        <w:t xml:space="preserve"> and</w:t>
-      </w:r>
-      <w:r>
-        <w:rPr>
-          <w:bCs/>
-        </w:rPr>
-        <w:t xml:space="preserve"> in [19], the first application of the PMM3 to linear regression with symmetric non-Gaussian errors of general form was presented.</w:t>
-      </w:r>
-      <w:r>
-        <w:rPr>
-          <w:bCs/>
-        </w:rPr>
-        <w:t xml:space="preserve"> </w:t>
+        <w:t xml:space="preserve">) and in [19], the first application of the PMM3 to linear regression with symmetric non-Gaussian errors of general form was presented. </w:t>
       </w:r>
       <w:r>
         <w:rPr>
           <w:rFonts w:eastAsia="Arial"/>
         </w:rPr>
-        <w:t xml:space="preserve">In [7], a normality test based on the sample skewness and kurtosis was proposed. The corresponding adaptive decision algorithm </w:t>
-      </w:r>
-      <w:proofErr w:type="gramStart"/>
-      <w:r>
-        <w:rPr>
-          <w:rFonts w:eastAsia="Arial"/>
-        </w:rPr>
-        <w:t>is:</w:t>
-      </w:r>
-      <w:proofErr w:type="gramEnd"/>
-      <w:r>
-        <w:rPr>
-          <w:rFonts w:eastAsia="Arial"/>
-        </w:rPr>
-        <w:t xml:space="preserve"> </w:t>
-      </w:r>
-      <w:r>
-        <w:rPr>
-          <w:rFonts w:eastAsia="Arial"/>
-        </w:rPr>
-        <w:t xml:space="preserve">normally </w:t>
-      </w:r>
-      <w:r>
-        <w:rPr>
-          <w:rFonts w:eastAsia="Arial"/>
-        </w:rPr>
-        <w:t xml:space="preserve">distributed residuals </w:t>
-      </w:r>
-      <w:r>
-        <w:rPr>
-          <w:rFonts w:eastAsia="Arial"/>
-        </w:rPr>
-        <w:t>–</w:t>
-      </w:r>
-      <w:r>
-        <w:rPr>
-          <w:rFonts w:eastAsia="Arial"/>
-        </w:rPr>
-        <w:t xml:space="preserve"> apply OLS;</w:t>
-      </w:r>
-      <w:r>
-        <w:rPr>
-          <w:rFonts w:eastAsia="Arial"/>
-        </w:rPr>
-        <w:t xml:space="preserve"> </w:t>
-      </w:r>
-      <w:r>
-        <w:rPr>
-          <w:rFonts w:eastAsia="Arial"/>
-        </w:rPr>
-        <w:t xml:space="preserve">asymmetric </w:t>
-      </w:r>
-      <w:r>
-        <w:rPr>
-          <w:rFonts w:eastAsia="Arial"/>
-        </w:rPr>
-        <w:t xml:space="preserve">residuals </w:t>
-      </w:r>
-      <w:r>
-        <w:rPr>
-          <w:rFonts w:eastAsia="Arial"/>
-        </w:rPr>
-        <w:t>–</w:t>
-      </w:r>
-      <w:r>
-        <w:rPr>
-          <w:rFonts w:eastAsia="Arial"/>
-        </w:rPr>
-        <w:t xml:space="preserve"> apply PMM2; </w:t>
-      </w:r>
-      <w:r>
-        <w:rPr>
-          <w:rFonts w:eastAsia="Arial"/>
-        </w:rPr>
-        <w:t xml:space="preserve">symmetric </w:t>
-      </w:r>
-      <w:r>
-        <w:rPr>
-          <w:rFonts w:eastAsia="Arial"/>
-        </w:rPr>
-        <w:t xml:space="preserve">platykurtic residuals </w:t>
-      </w:r>
-      <w:r>
-        <w:rPr>
-          <w:rFonts w:eastAsia="Arial"/>
-        </w:rPr>
-        <w:t>–</w:t>
-      </w:r>
-      <w:r>
-        <w:rPr>
-          <w:rFonts w:eastAsia="Arial"/>
-        </w:rPr>
-        <w:t xml:space="preserve"> apply PMM3.</w:t>
+        <w:t xml:space="preserve">In [7], a normality test based on the sample skewness and kurtosis was proposed. The corresponding adaptive decision algorithm is: normally distributed residuals – apply OLS; asymmetric residuals – apply PMM2; symmetric platykurtic residuals – apply PMM3.</w:t>
       </w:r>
     </w:p>
     <w:p>
@@ -1047,13 +725,7 @@
         <w:pStyle w:val="p1a"/>
       </w:pPr>
       <w:r>
-        <w:t xml:space="preserve">(i) </w:t>
-      </w:r>
-      <w:r>
-        <w:t>Theoretical comparison: derivation and analysis of analytical expressions for</w:t>
-      </w:r>
-      <w:r>
-        <w:t xml:space="preserve"> </w:t>
+        <w:t xml:space="preserve">(i) Theoretical comparison: derivation and analysis of analytical expressions for </w:t>
       </w:r>
       <m:oMath>
         <m:sSub>
@@ -1146,19 +818,7 @@
         </m:r>
       </m:oMath>
       <w:r>
-        <w:t xml:space="preserve">, and the efficiency curve comparing PMM3 and MLE-TN</w:t>
-      </w:r>
-      <w:r>
-        <w:t xml:space="preserve">; </w:t>
-      </w:r>
-      <w:r>
-        <w:t xml:space="preserve">(ii) </w:t>
-      </w:r>
-      <w:r>
-        <w:t>Monte Carlo validation</w:t>
-      </w:r>
-      <w:r>
-        <w:t xml:space="preserve">: </w:t>
+        <w:t xml:space="preserve">, and the efficiency curve comparing PMM3 and MLE-TN; (ii) Monte Carlo validation: </w:t>
       </w:r>
       <m:oMath>
         <m:r>
@@ -1169,10 +829,7 @@
         </m:r>
       </m:oMath>
       <w:r>
-        <w:t>,</w:t>
-      </w:r>
-      <w:r>
-        <w:t xml:space="preserve"> </w:t>
+        <w:t xml:space="preserve">, </w:t>
       </w:r>
       <m:oMath>
         <m:r>
@@ -1183,10 +840,7 @@
         </m:r>
       </m:oMath>
       <w:r>
-        <w:t xml:space="preserve">, </w:t>
-      </w:r>
-      <w:r>
-        <w:t xml:space="preserve">using </w:t>
+        <w:t xml:space="preserve">, using </w:t>
       </w:r>
       <m:oMath>
         <m:r>
@@ -1197,51 +851,7 @@
         </m:r>
       </m:oMath>
       <w:r>
-        <w:t>replications</w:t>
-      </w:r>
-      <w:r>
-        <w:t xml:space="preserve"/>
-      </w:r>
-      <w:r>
-        <w:t xml:space="preserve">; </w:t>
-      </w:r>
-      <w:r>
-        <w:t xml:space="preserve">(iii) </w:t>
-      </w:r>
-      <w:r>
-        <w:t xml:space="preserve">Robustness analysis: demonstration that PMM3 maintains </w:t>
-      </w:r>
-      <m:oMath>
-        <m:r>
-          <w:rPr>
-            <w:rFonts w:ascii="Cambria Math" w:hAnsi="Cambria Math"/>
-          </w:rPr>
-          <m:t>ARE≈1</m:t>
-        </m:r>
-      </m:oMath>
-      <w:r>
-        <w:t xml:space="preserve"> </w:t>
-      </w:r>
-      <w:r>
-        <w:t xml:space="preserve">under model misspecification, whereas MLE-TN may experience a substantial loss of efficiency</w:t>
-      </w:r>
-      <w:r>
-        <w:t xml:space="preserve">; </w:t>
-      </w:r>
-      <w:r>
-        <w:t xml:space="preserve">(iv) </w:t>
-      </w:r>
-      <w:r>
-        <w:t xml:space="preserve">Numerical stability: verification that the Newton-Raphson algorithm converges in 100% of the replications across all 24 Monte Carlo scenarios</w:t>
-      </w:r>
-      <w:r>
-        <w:t xml:space="preserve">; </w:t>
-      </w:r>
-      <w:r>
-        <w:t xml:space="preserve">(v) </w:t>
-      </w:r>
-      <w:r>
-        <w:t xml:space="preserve">Empirical threshold </w:t>
+        <w:t xml:space="preserve">replications; (iii) Robustness analysis: demonstration that PMM3 does not fall below OLS under model misspecification (ARE from 1.02 to 2.68), whereas MLE-TN may experience a substantial loss of efficiency; (iv) Numerical stability: verification that the Newton-Raphson algorithm converges in 100% of the replications across all 24 Monte Carlo scenarios; (v) Empirical threshold </w:t>
       </w:r>
       <m:oMath>
         <m:sSub>
@@ -1278,16 +888,7 @@
         </m:r>
       </m:oMath>
       <w:r>
-        <w:t xml:space="preserve">: establishment and justification of an empirical efficiency threshold based on seven real-world datasets</w:t>
-      </w:r>
-      <w:r>
-        <w:t xml:space="preserve">; </w:t>
-      </w:r>
-      <w:r>
-        <w:t xml:space="preserve">(vi) </w:t>
-      </w:r>
-      <w:r>
-        <w:t>Real-data application: analysis of the Iris versicolor dataset (</w:t>
+        <w:t xml:space="preserve">: establishment and justification of an empirical efficiency threshold based on seven real-world datasets; (vi) Real-data application: analysis of the Iris versicolor dataset (</w:t>
       </w:r>
       <m:oMath>
         <m:r>
@@ -1334,10 +935,7 @@
         </m:r>
       </m:oMath>
       <w:r>
-        <w:t>), demonstrating that PMM3 achieves a 43% reduction in variance.</w:t>
-      </w:r>
-      <w:r>
-        <w:t xml:space="preserve"/>
+        <w:t xml:space="preserve">), demonstrating that PMM3 achieves a 43% reduction in variance.</w:t>
       </w:r>
     </w:p>
     <w:p>
@@ -1581,10 +1179,7 @@
         </m:sSub>
       </m:oMath>
       <w:r>
-        <w:t xml:space="preserve"> </w:t>
-      </w:r>
-      <w:r>
-        <w:t xml:space="preserve">denotes the response variable, </w:t>
+        <w:t xml:space="preserve"> denotes the response variable, </w:t>
       </w:r>
       <m:oMath>
         <m:sSub>
@@ -1719,16 +1314,7 @@
         </m:sSub>
       </m:oMath>
       <w:r>
-        <w:t xml:space="preserve"> </w:t>
-      </w:r>
-      <w:r>
-        <w:t xml:space="preserve">are </w:t>
-      </w:r>
-      <w:r>
-        <w:t>independent and identically distributed random errors.</w:t>
-      </w:r>
-      <w:r>
-        <w:t xml:space="preserve"> </w:t>
+        <w:t xml:space="preserve"> are independent and identically distributed random errors. </w:t>
       </w:r>
     </w:p>
     <w:p>
@@ -1737,14 +1323,10 @@
           <w:b/>
           <w:bCs/>
         </w:rPr>
-        <w:t>Assumption</w:t>
-      </w:r>
-      <w:r>
-        <w:rPr>
-          <w:b/>
-          <w:bCs/>
-        </w:rPr>
-        <w:t>.</w:t>
+        <w:t xml:space="preserve">Assumption. For PMM3: </w:t>
+      </w:r>
+      <w:r>
+        <w:t xml:space="preserve">the error term satisfies</w:t>
       </w:r>
       <w:r>
         <w:rPr>
@@ -1753,26 +1335,79 @@
         </w:rPr>
         <w:t xml:space="preserve"> </w:t>
       </w:r>
+      <m:oMath>
+        <m:sSub>
+          <m:sSubPr>
+            <m:ctrlPr>
+              <w:rPr>
+                <w:rFonts w:ascii="Cambria Math" w:hAnsi="Cambria Math"/>
+              </w:rPr>
+            </m:ctrlPr>
+          </m:sSubPr>
+          <m:e>
+            <m:r>
+              <w:rPr>
+                <w:rFonts w:ascii="Cambria Math" w:hAnsi="Cambria Math"/>
+              </w:rPr>
+              <m:t>ε</m:t>
+            </m:r>
+          </m:e>
+          <m:sub>
+            <m:r>
+              <w:rPr>
+                <w:rFonts w:ascii="Cambria Math" w:hAnsi="Cambria Math"/>
+              </w:rPr>
+              <m:t>v</m:t>
+            </m:r>
+          </m:sub>
+        </m:sSub>
+      </m:oMath>
+      <w:r>
+        <w:t xml:space="preserve"> ~ a symmetric distribution with </w:t>
+      </w:r>
+      <m:oMath>
+        <m:r>
+          <w:rPr>
+            <w:rFonts w:ascii="Cambria Math" w:hAnsi="Cambria Math"/>
+          </w:rPr>
+          <m:t>E</m:t>
+        </m:r>
+        <m:d>
+          <m:dPr>
+            <m:ctrlPr>
+              <w:rPr>
+                <w:rFonts w:ascii="Cambria Math" w:hAnsi="Cambria Math"/>
+              </w:rPr>
+            </m:ctrlPr>
+          </m:dPr>
+          <m:e>
+            <m:r>
+              <w:rPr>
+                <w:rFonts w:ascii="Cambria Math" w:hAnsi="Cambria Math"/>
+              </w:rPr>
+              <m:t>ε</m:t>
+            </m:r>
+          </m:e>
+        </m:d>
+        <m:r>
+          <w:rPr>
+            <w:rFonts w:ascii="Cambria Math" w:hAnsi="Cambria Math"/>
+          </w:rPr>
+          <m:t>=0</m:t>
+        </m:r>
+      </m:oMath>
+      <w:r>
+        <w:t xml:space="preserve"> and possesses finite moments up to the sixth order. </w:t>
+      </w:r>
       <w:r>
         <w:rPr>
           <w:b/>
           <w:bCs/>
         </w:rPr>
-        <w:t xml:space="preserve">For </w:t>
-      </w:r>
-      <w:r>
-        <w:rPr>
-          <w:b/>
-          <w:bCs/>
-        </w:rPr>
-        <w:t>PMM3</w:t>
-      </w:r>
-      <w:r>
-        <w:rPr>
-          <w:b/>
-          <w:bCs/>
-        </w:rPr>
-        <w:t>:</w:t>
+        <w:t xml:space="preserve">For MLE-TN:</w:t>
+      </w:r>
+      <w:r>
+        <w:t xml:space="preserve"> the error term follows the Two-piece Normal distribution,</w:t>
       </w:r>
       <w:r>
         <w:rPr>
@@ -1781,19 +1416,6 @@
         </w:rPr>
         <w:t xml:space="preserve"> </w:t>
       </w:r>
-      <w:r>
-        <w:t xml:space="preserve">the </w:t>
-      </w:r>
-      <w:r>
-        <w:t>error term satisfies</w:t>
-      </w:r>
-      <w:r>
-        <w:rPr>
-          <w:b/>
-          <w:bCs/>
-        </w:rPr>
-        <w:t xml:space="preserve"> </w:t>
-      </w:r>
       <m:oMath>
         <m:sSub>
           <m:sSubPr>
@@ -1824,24 +1446,12 @@
       <w:r>
         <w:t xml:space="preserve"> ~ </w:t>
       </w:r>
-      <w:r>
-        <w:t>a symmetric distribution</w:t>
-      </w:r>
-      <w:r>
-        <w:t xml:space="preserve"> </w:t>
-      </w:r>
-      <w:r>
-        <w:t>with</w:t>
-      </w:r>
-      <w:r>
-        <w:t xml:space="preserve"> </w:t>
-      </w:r>
       <m:oMath>
         <m:r>
           <w:rPr>
             <w:rFonts w:ascii="Cambria Math" w:hAnsi="Cambria Math"/>
           </w:rPr>
-          <m:t>E</m:t>
+          <m:t>TN</m:t>
         </m:r>
         <m:d>
           <m:dPr>
@@ -1856,113 +1466,6 @@
               <w:rPr>
                 <w:rFonts w:ascii="Cambria Math" w:hAnsi="Cambria Math"/>
               </w:rPr>
-              <m:t>ε</m:t>
-            </m:r>
-          </m:e>
-        </m:d>
-        <m:r>
-          <w:rPr>
-            <w:rFonts w:ascii="Cambria Math" w:hAnsi="Cambria Math"/>
-          </w:rPr>
-          <m:t>=0</m:t>
-        </m:r>
-      </m:oMath>
-      <w:r>
-        <w:t xml:space="preserve"> </w:t>
-      </w:r>
-      <w:r>
-        <w:t>and possesses finite moments up to the sixth order.</w:t>
-      </w:r>
-      <w:r>
-        <w:t xml:space="preserve"> </w:t>
-      </w:r>
-      <w:r>
-        <w:rPr>
-          <w:b/>
-          <w:bCs/>
-        </w:rPr>
-        <w:t xml:space="preserve">For </w:t>
-      </w:r>
-      <w:r>
-        <w:rPr>
-          <w:b/>
-          <w:bCs/>
-        </w:rPr>
-        <w:t>MLE-TN</w:t>
-      </w:r>
-      <w:r>
-        <w:rPr>
-          <w:b/>
-          <w:bCs/>
-        </w:rPr>
-        <w:t>:</w:t>
-      </w:r>
-      <w:r>
-        <w:t xml:space="preserve"> </w:t>
-      </w:r>
-      <w:r>
-        <w:t xml:space="preserve">the </w:t>
-      </w:r>
-      <w:r>
-        <w:t>error term follows the Two-piece Normal distribution,</w:t>
-      </w:r>
-      <w:r>
-        <w:rPr>
-          <w:b/>
-          <w:bCs/>
-        </w:rPr>
-        <w:t xml:space="preserve"> </w:t>
-      </w:r>
-      <m:oMath>
-        <m:sSub>
-          <m:sSubPr>
-            <m:ctrlPr>
-              <w:rPr>
-                <w:rFonts w:ascii="Cambria Math" w:hAnsi="Cambria Math"/>
-              </w:rPr>
-            </m:ctrlPr>
-          </m:sSubPr>
-          <m:e>
-            <m:r>
-              <w:rPr>
-                <w:rFonts w:ascii="Cambria Math" w:hAnsi="Cambria Math"/>
-              </w:rPr>
-              <m:t>ε</m:t>
-            </m:r>
-          </m:e>
-          <m:sub>
-            <m:r>
-              <w:rPr>
-                <w:rFonts w:ascii="Cambria Math" w:hAnsi="Cambria Math"/>
-              </w:rPr>
-              <m:t>v</m:t>
-            </m:r>
-          </m:sub>
-        </m:sSub>
-      </m:oMath>
-      <w:r>
-        <w:t xml:space="preserve"> ~ </w:t>
-      </w:r>
-      <m:oMath>
-        <m:r>
-          <w:rPr>
-            <w:rFonts w:ascii="Cambria Math" w:hAnsi="Cambria Math"/>
-          </w:rPr>
-          <m:t>TN</m:t>
-        </m:r>
-        <m:d>
-          <m:dPr>
-            <m:ctrlPr>
-              <w:rPr>
-                <w:rFonts w:ascii="Cambria Math" w:hAnsi="Cambria Math"/>
-              </w:rPr>
-            </m:ctrlPr>
-          </m:dPr>
-          <m:e>
-            <m:r>
-              <w:rPr>
-                <w:rFonts w:ascii="Cambria Math" w:hAnsi="Cambria Math"/>
-              </w:rPr>
               <m:t>0,η,λ</m:t>
             </m:r>
           </m:e>
@@ -1978,13 +1481,7 @@
       </w:pPr>
       <w:r>
         <w:lastRenderedPageBreak/>
-        <w:t xml:space="preserve">Two-piece </w:t>
-      </w:r>
-      <w:r>
-        <w:t xml:space="preserve">Normal </w:t>
-      </w:r>
-      <w:r>
-        <w:t>(TN) distribution</w:t>
+        <w:t xml:space="preserve">Two-piece Normal (TN) distribution</w:t>
       </w:r>
     </w:p>
     <w:p>
@@ -2333,8 +1830,6 @@
       </m:oMath>
       <w:r>
         <w:t>.</w:t>
-      </w:r>
-      <w:r>
         <w:tab/>
         <w:t>(</w:t>
       </w:r>
@@ -2355,13 +1850,7 @@
         <w:pStyle w:val="p1a"/>
       </w:pPr>
       <w:r>
-        <w:t>The principal properties of the TN distribution are as follows</w:t>
-      </w:r>
-      <w:r>
-        <w:t>:</w:t>
-      </w:r>
-      <w:r>
-        <w:t xml:space="preserve"> </w:t>
+        <w:t xml:space="preserve">The principal properties of the TN distribution are as follows: </w:t>
       </w:r>
       <m:oMath>
         <m:r>
@@ -2372,64 +1861,18 @@
         </m:r>
       </m:oMath>
       <w:r>
-        <w:t xml:space="preserve"> – </w:t>
-      </w:r>
-      <w:r>
-        <w:t xml:space="preserve">the distribution approaches the standard normal distribution </w:t>
-      </w:r>
-      <w:proofErr w:type="gramStart"/>
-      <w:r>
-        <w:t>N(</w:t>
-      </w:r>
-      <w:proofErr w:type="gramEnd"/>
-      <w:r>
-        <w:t>0, 1)</w:t>
-      </w:r>
-      <w:r>
-        <w:t>;</w:t>
-      </w:r>
-      <w:r>
-        <w:t xml:space="preserve"> </w:t>
+        <w:t xml:space="preserve"> – the distribution approaches the standard normal distribution N(0, 1); </w:t>
       </w:r>
       <m:oMath>
         <m:r>
           <w:rPr>
             <w:rFonts w:ascii="Cambria Math" w:hAnsi="Cambria Math"/>
           </w:rPr>
-          <m:t>λ&gt;1/</m:t>
-        </m:r>
-        <m:rad>
-          <m:radPr>
-            <m:degHide m:val="1"/>
-            <m:ctrlPr>
-              <w:rPr>
-                <w:rFonts w:ascii="Cambria Math" w:hAnsi="Cambria Math"/>
-                <w:i/>
-              </w:rPr>
-            </m:ctrlPr>
-          </m:radPr>
-          <m:deg/>
-          <m:e>
-            <m:r>
-              <w:rPr>
-                <w:rFonts w:ascii="Cambria Math" w:hAnsi="Cambria Math"/>
-              </w:rPr>
-              <m:t>2</m:t>
-            </m:r>
-          </m:e>
-        </m:rad>
+          <m:t>λ&gt;1</m:t>
+        </m:r>
       </m:oMath>
       <w:r>
-        <w:t xml:space="preserve"> –</w:t>
-      </w:r>
-      <w:r>
-        <w:t xml:space="preserve"> </w:t>
-      </w:r>
-      <w:r>
-        <w:t>the distribution becomes bimodal, exhibiting two symmetric modes;</w:t>
-      </w:r>
-      <w:r>
-        <w:t xml:space="preserve"> </w:t>
+        <w:t xml:space="preserve"> – the distribution becomes bimodal, exhibiting two symmetric modes; </w:t>
       </w:r>
       <m:oMath>
         <m:sSub>
@@ -2508,10 +1951,7 @@
         <w:pStyle w:val="p1a"/>
       </w:pPr>
       <w:r>
-        <w:t>The normalized excess kurtosis is given by</w:t>
-      </w:r>
-      <w:r>
-        <w:t>:</w:t>
+        <w:t>The normalized excess kurtosis is given by:</w:t>
       </w:r>
     </w:p>
     <w:p>
@@ -2661,10 +2101,7 @@
         </m:r>
       </m:oMath>
       <w:r>
-        <w:t xml:space="preserve"> </w:t>
-      </w:r>
-      <w:r>
-        <w:t xml:space="preserve">for all </w:t>
+        <w:t xml:space="preserve"> for all </w:t>
       </w:r>
       <m:oMath>
         <m:r>
@@ -2685,11 +2122,7 @@
       </m:oMath>
       <w:r>
         <w:t>.</w:t>
-      </w:r>
-      <w:r>
         <w:tab/>
-      </w:r>
-      <w:r>
         <w:t>(</w:t>
       </w:r>
       <w:fldSimple w:instr=" SEQ &quot;equation&quot; \n \* MERGEFORMAT ">
@@ -2750,13 +2183,7 @@
         </m:d>
       </m:oMath>
       <w:r>
-        <w:t xml:space="preserve"> </w:t>
-      </w:r>
-      <w:r>
-        <w:t>by maximizing the log-likelihood function</w:t>
-      </w:r>
-      <w:r>
-        <w:t>:</w:t>
+        <w:t xml:space="preserve"> by maximizing the log-likelihood function:</w:t>
       </w:r>
     </w:p>
     <w:p>
@@ -3081,8 +2508,6 @@
       </m:oMath>
       <w:r>
         <w:t>.</w:t>
-      </w:r>
-      <w:r>
         <w:tab/>
         <w:t>(</w:t>
       </w:r>
@@ -3286,13 +2711,7 @@
         <w:rPr>
           <w:rFonts w:eastAsia="Arial"/>
         </w:rPr>
-        <w:t>,</w:t>
-      </w:r>
-      <w:r>
-        <w:rPr>
-          <w:rFonts w:eastAsia="Arial"/>
-        </w:rPr>
-        <w:t xml:space="preserve"> </w:t>
+        <w:t xml:space="preserve">, </w:t>
       </w:r>
       <m:oMath>
         <m:sSub>
@@ -3332,19 +2751,7 @@
         <w:rPr>
           <w:rFonts w:eastAsia="Arial"/>
         </w:rPr>
-        <w:t>.</w:t>
-      </w:r>
-      <w:r>
-        <w:rPr>
-          <w:rFonts w:eastAsia="Arial"/>
-        </w:rPr>
-        <w:t xml:space="preserve"> </w:t>
-      </w:r>
-      <w:r>
-        <w:rPr>
-          <w:rFonts w:eastAsia="Arial"/>
-        </w:rPr>
-        <w:t xml:space="preserve">Advantages: achieves the Cramér–Rao lower bound under correct model specification; provides </w:t>
+        <w:t xml:space="preserve">. Advantages: achieves the Cramér–Rao lower bound under correct model specification; provides </w:t>
       </w:r>
       <m:oMath>
         <m:r>
@@ -3395,63 +2802,21 @@
         <w:rPr>
           <w:rFonts w:eastAsia="Arial"/>
         </w:rPr>
-        <w:t>.</w:t>
-      </w:r>
+        <w:t xml:space="preserve">. Limitations: requires estimation of </w:t>
+      </w:r>
+      <m:oMath>
+        <m:r>
+          <w:rPr>
+            <w:rFonts w:ascii="Cambria Math" w:eastAsia="Arial" w:hAnsi="Cambria Math"/>
+          </w:rPr>
+          <m:t>p+2</m:t>
+        </m:r>
+      </m:oMath>
       <w:r>
         <w:rPr>
           <w:rFonts w:eastAsia="Arial"/>
         </w:rPr>
-        <w:t xml:space="preserve"> </w:t>
-      </w:r>
-      <w:r>
-        <w:rPr>
-          <w:rFonts w:eastAsia="Arial"/>
-        </w:rPr>
-        <w:t xml:space="preserve">Limitations: requires estimation of </w:t>
-      </w:r>
-      <m:oMath>
-        <m:r>
-          <w:rPr>
-            <w:rFonts w:ascii="Cambria Math" w:eastAsia="Arial" w:hAnsi="Cambria Math"/>
-          </w:rPr>
-          <m:t>p+2</m:t>
-        </m:r>
-      </m:oMath>
-      <w:r>
-        <w:rPr>
-          <w:rFonts w:eastAsia="Arial"/>
-        </w:rPr>
-        <w:t xml:space="preserve"> </w:t>
-      </w:r>
-      <w:r>
-        <w:rPr>
-          <w:rFonts w:eastAsia="Arial"/>
-        </w:rPr>
-        <w:t>parameters;</w:t>
-      </w:r>
-      <w:r>
-        <w:rPr>
-          <w:rFonts w:eastAsia="Arial"/>
-        </w:rPr>
-        <w:t xml:space="preserve"> </w:t>
-      </w:r>
-      <w:r>
-        <w:rPr>
-          <w:rFonts w:eastAsia="Arial"/>
-        </w:rPr>
-        <w:t>is sensitive to model misspecification; may exhibit numerical instability for small sample sizes and large</w:t>
-      </w:r>
-      <w:r>
-        <w:rPr>
-          <w:rFonts w:eastAsia="Arial"/>
-        </w:rPr>
-        <w:t xml:space="preserve"> n</w:t>
-      </w:r>
-      <w:r>
-        <w:rPr>
-          <w:rFonts w:eastAsia="Arial"/>
-        </w:rPr>
-        <w:t xml:space="preserve"> values of </w:t>
+        <w:t xml:space="preserve"> parameters; is sensitive to model misspecification; may exhibit numerical instability for small sample sizes and large n values of </w:t>
       </w:r>
       <m:oMath>
         <m:r>
@@ -3473,10 +2838,7 @@
         <w:pStyle w:val="heading2"/>
       </w:pPr>
       <w:r>
-        <w:t xml:space="preserve">PMM3: Polynomial Maximization Method </w:t>
-      </w:r>
-      <w:r>
-        <w:t>(S = 3)</w:t>
+        <w:t xml:space="preserve">PMM3: Polynomial Maximization Method (S = 3)</w:t>
       </w:r>
     </w:p>
     <w:p>
@@ -3495,19 +2857,7 @@
         </m:r>
       </m:oMath>
       <w:r>
-        <w:t xml:space="preserve"> by employing a moment-corrected score function. </w:t>
-      </w:r>
-      <w:r>
-        <w:t>The algorithm consists of the following steps</w:t>
-      </w:r>
-      <w:r>
-        <w:t>:</w:t>
-      </w:r>
-      <w:r>
-        <w:t xml:space="preserve"> </w:t>
-      </w:r>
-      <w:r>
-        <w:t xml:space="preserve">compute the initial estimate </w:t>
+        <w:t xml:space="preserve"> by employing a moment-corrected score function. The algorithm consists of the following steps: compute the initial estimate </w:t>
       </w:r>
       <m:oMath>
         <m:sSup>
@@ -3568,10 +2918,7 @@
         </m:r>
       </m:oMath>
       <w:r>
-        <w:t xml:space="preserve"> and evaluate the sample central moments of the residuals</w:t>
-      </w:r>
-      <w:r>
-        <w:t xml:space="preserve"> m</w:t>
+        <w:t xml:space="preserve"> and evaluate the sample central moments of the residuals m</w:t>
       </w:r>
       <w:r>
         <w:rPr>
@@ -3598,10 +2945,7 @@
         <w:t>6</w:t>
       </w:r>
       <w:r>
-        <w:t xml:space="preserve">, then </w:t>
-      </w:r>
-      <w:r>
-        <w:t>the correction coefficient is estimated once according to</w:t>
+        <w:t xml:space="preserve">, then the correction coefficient is estimated once according to</w:t>
       </w:r>
     </w:p>
     <w:p>
@@ -3827,8 +3171,6 @@
       </m:oMath>
       <w:r>
         <w:t>.</w:t>
-      </w:r>
-      <w:r>
         <w:tab/>
         <w:t>(</w:t>
       </w:r>
@@ -3849,13 +3191,7 @@
         <w:rPr>
           <w:rFonts w:eastAsia="Arial"/>
         </w:rPr>
-        <w:t>If the corresponding condition is violated</w:t>
-      </w:r>
-      <w:r>
-        <w:rPr>
-          <w:rFonts w:eastAsia="Arial"/>
-        </w:rPr>
-        <w:t xml:space="preserve"> </w:t>
+        <w:t xml:space="preserve">If the corresponding condition is violated </w:t>
       </w:r>
       <m:oMath>
         <m:d>
@@ -3994,13 +3330,7 @@
         <w:rPr>
           <w:rFonts w:eastAsia="Arial"/>
         </w:rPr>
-        <w:t>, the algorithm returns the Gaussian fallback solution</w:t>
-      </w:r>
-      <w:r>
-        <w:rPr>
-          <w:rFonts w:eastAsia="Arial"/>
-        </w:rPr>
-        <w:t xml:space="preserve"> </w:t>
+        <w:t xml:space="preserve">, the algorithm returns the Gaussian fallback solution </w:t>
       </w:r>
       <m:oMath>
         <m:acc>
@@ -4039,19 +3369,7 @@
         <w:rPr>
           <w:rFonts w:eastAsia="Arial"/>
         </w:rPr>
-        <w:t xml:space="preserve">The </w:t>
-      </w:r>
-      <w:r>
-        <w:rPr>
-          <w:rFonts w:eastAsia="Arial"/>
-        </w:rPr>
-        <w:t>parameter vector is updated according to the Newton-Raphson procedure:</w:t>
-      </w:r>
-      <w:r>
-        <w:rPr>
-          <w:rFonts w:eastAsia="Arial"/>
-        </w:rPr>
-        <w:t xml:space="preserve"> </w:t>
+        <w:t xml:space="preserve">The parameter vector is updated according to the Newton-Raphson procedure: </w:t>
       </w:r>
       <m:oMath>
         <m:sSub>
@@ -4229,13 +3547,7 @@
         <w:rPr>
           <w:rFonts w:eastAsia="Arial"/>
         </w:rPr>
-        <w:t>;</w:t>
-      </w:r>
-      <w:r>
-        <w:rPr>
-          <w:rFonts w:eastAsia="Arial"/>
-        </w:rPr>
-        <w:t xml:space="preserve"> </w:t>
+        <w:t xml:space="preserve">; </w:t>
       </w:r>
       <m:oMath>
         <m:r>
@@ -4359,19 +3671,7 @@
         <w:rPr>
           <w:rFonts w:eastAsia="Arial"/>
         </w:rPr>
-        <w:t>.</w:t>
-      </w:r>
-      <w:r>
-        <w:rPr>
-          <w:rFonts w:eastAsia="Arial"/>
-        </w:rPr>
-        <w:t xml:space="preserve"> The i</w:t>
-      </w:r>
-      <w:r>
-        <w:rPr>
-          <w:rFonts w:eastAsia="Arial"/>
-        </w:rPr>
-        <w:t xml:space="preserve">terations continue until the prescribed convergence criterion is satisfied: </w:t>
+        <w:t xml:space="preserve">. The iterations continue until the prescribed convergence criterion is satisfied: </w:t>
       </w:r>
       <m:oMath>
         <m:sSub>
@@ -4451,36 +3751,7 @@
         <w:rPr>
           <w:rFonts w:eastAsia="Arial"/>
         </w:rPr>
-        <w:t>.</w:t>
-      </w:r>
-      <w:r>
-        <w:rPr>
-          <w:rFonts w:eastAsia="Arial"/>
-        </w:rPr>
-        <w:t xml:space="preserve"> In practice, convergence is typically achieved within 3-5 iterations.</w:t>
-      </w:r>
-      <w:r>
-        <w:rPr>
-          <w:rFonts w:eastAsia="Arial"/>
-        </w:rPr>
-        <w:t xml:space="preserve"> </w:t>
-      </w:r>
-      <w:r>
-        <w:rPr>
-          <w:rFonts w:eastAsia="Arial"/>
-        </w:rPr>
-        <w:t xml:space="preserve">To </w:t>
-      </w:r>
-      <w:r>
-        <w:rPr>
-          <w:rFonts w:eastAsia="Arial"/>
-        </w:rPr>
-        <w:t xml:space="preserve">ensure numerical stability, </w:t>
-      </w:r>
-      <w:r>
-        <w:rPr>
-          <w:rFonts w:eastAsia="Arial"/>
-        </w:rPr>
+        <w:t xml:space="preserve">. In practice, convergence is typically achieved within 3-5 iterations. To ensure numerical stability, </w:t>
         <w:lastRenderedPageBreak/>
         <w:t xml:space="preserve">if the specified divergence condition is met, </w:t>
       </w:r>
@@ -4533,19 +3804,7 @@
         <w:rPr>
           <w:rFonts w:eastAsia="Arial"/>
         </w:rPr>
-        <w:t>&gt;10</w:t>
-      </w:r>
-      <w:r>
-        <w:rPr>
-          <w:rFonts w:eastAsia="Arial"/>
-        </w:rPr>
-        <w:t xml:space="preserve"> the algorithm returns the initial estimate</w:t>
-      </w:r>
-      <w:r>
-        <w:rPr>
-          <w:rFonts w:eastAsia="Arial"/>
-        </w:rPr>
-        <w:t xml:space="preserve"> </w:t>
+        <w:t xml:space="preserve">&gt;10 the algorithm returns the initial estimate </w:t>
       </w:r>
       <m:oMath>
         <m:r>
@@ -4775,8 +4034,6 @@
       </m:oMath>
       <w:r>
         <w:t>,</w:t>
-      </w:r>
-      <w:r>
         <w:tab/>
         <w:t>(</w:t>
       </w:r>
@@ -5111,34 +4368,7 @@
         </m:f>
       </m:oMath>
       <w:r>
-        <w:t xml:space="preserve"> </w:t>
-      </w:r>
-      <w:r>
-        <w:t>–</w:t>
-      </w:r>
-      <w:r>
-        <w:t xml:space="preserve"> </w:t>
-      </w:r>
-      <w:r>
-        <w:t>normalized fourth</w:t>
-      </w:r>
-      <w:r>
-        <w:t xml:space="preserve"> </w:t>
-      </w:r>
-      <w:r>
-        <w:t>and sixth-order cumulants</w:t>
-      </w:r>
-      <w:r>
-        <w:t>.</w:t>
-      </w:r>
-      <w:r>
-        <w:t xml:space="preserve"> </w:t>
-      </w:r>
-      <w:r>
-        <w:t xml:space="preserve">An important advantage of PMM3 is that it does not require knowledge of the </w:t>
-      </w:r>
-      <w:r>
-        <w:t>distribution: cumulants are estimated directly from the sample.</w:t>
+        <w:t xml:space="preserve"> – normalized fourth and sixth-order cumulants. An important advantage of PMM3 is that it does not require knowledge of the distribution: cumulants are estimated directly from the sample.</w:t>
       </w:r>
     </w:p>
     <w:p>
@@ -5154,10 +4384,7 @@
         <w:ind w:firstLine="0"/>
       </w:pPr>
       <w:r>
-        <w:t>Under the standard regularity conditions, the PMM3 estimator is consistent and asymptotically normally distributed.</w:t>
-      </w:r>
-      <w:r>
-        <w:t xml:space="preserve"> </w:t>
+        <w:t xml:space="preserve">Under the standard regularity conditions, the PMM3 estimator is consistent and asymptotically normally distributed. </w:t>
       </w:r>
       <m:oMath>
         <m:rad>
@@ -5338,16 +4565,7 @@
         </m:r>
       </m:oMath>
       <w:r>
-        <w:t xml:space="preserve"/>
-      </w:r>
-      <w:r>
-        <w:t xml:space="preserve"> </w:t>
-      </w:r>
-      <w:r>
-        <w:t>Its asymptotic covariance matrix is reduced by a factor of</w:t>
-      </w:r>
-      <w:r>
-        <w:t xml:space="preserve"> (</w:t>
+        <w:t xml:space="preserve"> Its asymptotic covariance matrix is reduced by a factor of (</w:t>
       </w:r>
       <m:oMath>
         <m:r>
@@ -5384,13 +4602,7 @@
         </m:sSub>
       </m:oMath>
       <w:r>
-        <w:t xml:space="preserve">) </w:t>
-      </w:r>
-      <w:r>
-        <w:t>relative to that of the OLS estimator:</w:t>
-      </w:r>
-      <w:r>
-        <w:t xml:space="preserve"> </w:t>
+        <w:t xml:space="preserve">) relative to that of the OLS estimator: </w:t>
       </w:r>
       <m:oMath>
         <m:r>
@@ -5528,10 +4740,7 @@
         </w:rPr>
       </w:pPr>
       <w:r>
-        <w:t>For the Gaussian case</w:t>
-      </w:r>
-      <w:r>
-        <w:t xml:space="preserve"> </w:t>
+        <w:t xml:space="preserve">For the Gaussian case </w:t>
       </w:r>
       <m:oMath>
         <m:sSub>
@@ -5606,16 +4815,7 @@
         </m:r>
       </m:oMath>
       <w:r>
-        <w:t xml:space="preserve"> </w:t>
-      </w:r>
-      <w:r>
-        <w:t>PMM3 is asymptotically equivalent to OLS.</w:t>
-      </w:r>
-      <w:r>
-        <w:t xml:space="preserve"> </w:t>
-      </w:r>
-      <w:r>
-        <w:t>For platykurtic distributions (</w:t>
+        <w:t xml:space="preserve"> PMM3 is asymptotically equivalent to OLS. For platykurtic distributions (</w:t>
       </w:r>
       <m:oMath>
         <m:sSub>
@@ -5690,46 +4890,13 @@
         </m:r>
       </m:oMath>
       <w:r>
-        <w:t xml:space="preserve"> </w:t>
-      </w:r>
-      <w:r>
-        <w:t>PMM3 is more efficient than OLS.</w:t>
-      </w:r>
-      <w:r>
-        <w:t xml:space="preserve"> </w:t>
-      </w:r>
-      <w:r>
-        <w:t>The consistency of PMM3 depends only on the assumption of zero-mean errors and does not require specification of the exact distributional form</w:t>
-      </w:r>
-      <w:r>
-        <w:t>.</w:t>
-      </w:r>
-      <w:r>
-        <w:t xml:space="preserve"> </w:t>
+        <w:t xml:space="preserve"> PMM3 is more efficient than OLS. The consistency of PMM3 depends only on the assumption of zero-mean errors and does not require specification of the exact distributional form. </w:t>
       </w:r>
       <w:r>
         <w:rPr>
           <w:rFonts w:eastAsia="Arial"/>
         </w:rPr>
-        <w:t>A more detailed derivation is provided in [10] and [20]</w:t>
-      </w:r>
-      <w:r>
-        <w:rPr>
-          <w:rFonts w:eastAsia="Arial"/>
-        </w:rPr>
-        <w:t>.</w:t>
-      </w:r>
-      <w:r>
-        <w:rPr>
-          <w:rFonts w:eastAsia="Arial"/>
-        </w:rPr>
-        <w:t xml:space="preserve"> </w:t>
-      </w:r>
-      <w:r>
-        <w:rPr>
-          <w:rFonts w:eastAsia="Arial"/>
-        </w:rPr>
-        <w:t xml:space="preserve">The three methods differ in what they must assume. OLS and PMM3 both estimate only the p coefficients of the vector and require no knowledge of the distributional form, whereas MLE-TN estimates p + 2 parameters and requires the TN form to be correctly specified. Under TN errors OLS is the baseline (ARE = 1), PMM3 attains g₃ &lt; 1 whenever the fourth-order cumulant is negative, and MLE-TN attains the Cramér–Rao bound.</w:t>
+        <w:t xml:space="preserve">A more detailed derivation is provided in [10] and [20]. The three methods differ in what they must assume. OLS and PMM3 both estimate only the p coefficients of the vector and require no knowledge of the distributional form, whereas MLE-TN estimates p + 2 parameters and requires the TN form to be correctly specified. Under TN errors OLS is the baseline (ARE = 1), PMM3 attains g₃ &lt; 1 whenever the fourth-order cumulant is negative, and MLE-TN attains the Cramér–Rao bound.</w:t>
       </w:r>
     </w:p>
     <w:p>
@@ -5781,7 +4948,7 @@
         </m:r>
       </m:oMath>
       <w:r>
-        <w:t xml:space="preserve"> in the right panel. Evaluated at the six shape values used throughout this study, the moment formulas give γ₄ = -0.080, -0.500, -0.959, -1.280, -1.620 and -1.849 with g₃ = 0.9988, 0.9286, 0.6574, 0.3868, 0.1490 and 0.0454 for λ = 0.5, 1.0, 1.5, 2.0, 3.0 and 5.0, corresponding to a variance reduction relative to OLS of 0.1%, 7.1%, 34.3%, 61.3%, 85.1% and 95.5%. The distribution is bimodal for λ &gt; 1/√2, that is for every λ ≥ 1.5 in this set.</w:t>
+        <w:t xml:space="preserve"> in the right panel. Evaluated at the six shape values used throughout this study, the moment formulas give γ₄ = -0.080, -0.500, -0.959, -1.280, -1.620 and -1.849 with g₃ = 0.9988, 0.9286, 0.6574, 0.3868, 0.1490 and 0.0454 for λ = 0.5, 1.0, 1.5, 2.0, 3.0 and 5.0, corresponding to a variance reduction relative to OLS of 0.1%, 7.1%, 34.3%, 61.3%, 85.1% and 95.5%. The distribution is bimodal for λ &gt; 1, that is for every λ ≥ 1.5 in this set.</w:t>
       </w:r>
     </w:p>
     <w:p>
@@ -5796,7 +4963,7 @@
         <w:lastRenderedPageBreak/>
         <w:drawing>
           <wp:inline distT="0" distB="0" distL="0" distR="0" wp14:anchorId="6AA42B62" wp14:editId="362407EA">
-            <wp:extent cx="4284000" cy="1240510"/>
+            <wp:extent cx="4284000" cy="1248618"/>
             <wp:effectExtent l="0" t="0" r="0" b="0"/>
             <wp:docPr id="1" name="Рисунок 1"/>
             <wp:cNvGraphicFramePr>
@@ -5812,7 +4979,7 @@
                   <pic:blipFill rotWithShape="1">
                     <a:blip r:embed="rId16" cstate="print">
                       <a:extLst>
-                        <a:ext uri="{28A0092B-C50C-407E-A947-70E740481C1C}" cx="4284000" cy="1240510">
+                        <a:ext uri="{28A0092B-C50C-407E-A947-70E740481C1C}" cx="4284000" cy="1248618">
                           <a14:useLocalDpi xmlns:a14="http://schemas.microsoft.com/office/drawing/2010/main" val="0"/>
                         </a:ext>
                       </a:extLst>
@@ -5824,7 +4991,7 @@
                   <pic:spPr bwMode="auto">
                     <a:xfrm>
                       <a:off x="0" y="0"/>
-                      <a:ext cx="4284000" cy="1240510"/>
+                      <a:ext cx="4284000" cy="1248618"/>
                     </a:xfrm>
                     <a:prstGeom prst="rect">
                       <a:avLst/>
@@ -5833,7 +5000,7 @@
                       <a:noFill/>
                     </a:ln>
                     <a:extLst>
-                      <a:ext uri="{53640926-AAD7-44D8-BBD7-CCE9431645EC}" cx="4284000" cy="1240510">
+                      <a:ext uri="{53640926-AAD7-44D8-BBD7-CCE9431645EC}" cx="4284000" cy="1248618">
                         <a14:shadowObscured xmlns:a14="http://schemas.microsoft.com/office/drawing/2010/main"/>
                       </a:ext>
                     </a:extLst>
@@ -5858,7 +5025,7 @@
           <w:rFonts w:eastAsia="Arial"/>
           <w:b/>
         </w:rPr>
-        <w:t xml:space="preserve">Fig. 1. Two-piece Normal model. Left: TN densities for λ ∈ {0.5, 1, 1.5, 2, 3}, standard normal dashed. Right: theoretical efficiency g₃ as a function of λ; the dotted line marks the bimodality boundary λ = 1/√2, unimodal cases green, bimodal red.</w:t>
+        <w:t xml:space="preserve">Fig. 1. Two-piece Normal model. Left: TN densities for λ ∈ {0.5, 1, 1.5, 2, 3}, standard normal dashed. Right: theoretical efficiency g₃ as a function of λ; the dotted line marks the bimodality boundary λ = 1, unimodal cases green, bimodal red.</w:t>
       </w:r>
     </w:p>
     <w:p>
@@ -5889,10 +5056,7 @@
         <w:pStyle w:val="p1a"/>
       </w:pPr>
       <w:r>
-        <w:t>The data-generating model is defined as</w:t>
-      </w:r>
-      <w:r>
-        <w:t>:</w:t>
+        <w:t>The data-generating model is defined as:</w:t>
       </w:r>
     </w:p>
     <w:p>
@@ -6101,8 +5265,6 @@
       </m:oMath>
       <w:r>
         <w:t>.</w:t>
-      </w:r>
-      <w:r>
         <w:tab/>
         <w:t>(</w:t>
       </w:r>
@@ -6126,19 +5288,10 @@
         <w:rPr>
           <w:rFonts w:eastAsia="Arial"/>
         </w:rPr>
-        <w:t>The simulation parameters</w:t>
-      </w:r>
-      <w:r>
-        <w:rPr>
-          <w:rFonts w:eastAsia="Arial"/>
-        </w:rPr>
-        <w:t>:</w:t>
-      </w:r>
-      <w:r>
-        <w:t xml:space="preserve"> </w:t>
-      </w:r>
-      <w:r>
-        <w:t>number of replications</w:t>
+        <w:t>The simulation parameters:</w:t>
+      </w:r>
+      <w:r>
+        <w:t xml:space="preserve"> number of replications</w:t>
       </w:r>
       <w:r>
         <w:rPr>
@@ -6156,16 +5309,7 @@
         </m:r>
       </m:oMath>
       <w:r>
-        <w:t xml:space="preserve">; </w:t>
-      </w:r>
-      <w:r>
-        <w:t>sample sizes</w:t>
-      </w:r>
-      <w:r>
-        <w:t xml:space="preserve"> </w:t>
-      </w:r>
-      <w:r>
-        <w:t xml:space="preserve">n </w:t>
+        <w:t xml:space="preserve">; sample sizes n </w:t>
       </w:r>
       <w:r>
         <w:rPr>
@@ -6174,21 +5318,7 @@
         <w:t>∈</w:t>
       </w:r>
       <w:r>
-        <w:t xml:space="preserve"> {46, 100, 200, </w:t>
-      </w:r>
-      <w:proofErr w:type="gramStart"/>
-      <w:r>
-        <w:t>500};</w:t>
-      </w:r>
-      <w:proofErr w:type="gramEnd"/>
-      <w:r>
-        <w:t xml:space="preserve"> </w:t>
-      </w:r>
-      <w:r>
-        <w:t>shape parameters</w:t>
-      </w:r>
-      <w:r>
-        <w:t xml:space="preserve"> </w:t>
+        <w:t xml:space="preserve"> {46, 100, 200, 500}; shape parameters </w:t>
       </w:r>
       <m:oMath>
         <m:r>
@@ -6199,19 +5329,7 @@
         </m:r>
       </m:oMath>
       <w:r>
-        <w:t xml:space="preserve">; </w:t>
-      </w:r>
-      <w:r>
-        <w:t>random seed</w:t>
-      </w:r>
-      <w:r>
-        <w:t xml:space="preserve"> </w:t>
-      </w:r>
-      <w:r>
-        <w:t>= 20260312.</w:t>
-      </w:r>
-      <w:r>
-        <w:t xml:space="preserve"> </w:t>
+        <w:t xml:space="preserve">; random seed = 20260312. </w:t>
       </w:r>
     </w:p>
     <w:p>
@@ -6223,13 +5341,7 @@
           <w:rFonts w:eastAsia="Arial"/>
         </w:rPr>
         <w:lastRenderedPageBreak/>
-        <w:t>Metrics</w:t>
-      </w:r>
-      <w:r>
-        <w:rPr>
-          <w:rFonts w:eastAsia="Arial"/>
-        </w:rPr>
-        <w:t>:</w:t>
+        <w:t>Metrics:</w:t>
       </w:r>
       <w:r>
         <w:t xml:space="preserve"> </w:t>
@@ -6291,13 +5403,7 @@
         <w:rPr>
           <w:rFonts w:eastAsia="Arial"/>
         </w:rPr>
-        <w:t xml:space="preserve">; </w:t>
-      </w:r>
-      <w:r>
-        <w:rPr>
-          <w:rFonts w:eastAsia="Arial"/>
-        </w:rPr>
-        <w:t>Var</w:t>
+        <w:t xml:space="preserve">; Var</w:t>
       </w:r>
       <m:oMath>
         <m:r>
@@ -6347,33 +5453,7 @@
         <w:rPr>
           <w:rFonts w:eastAsia="Arial"/>
         </w:rPr>
-        <w:t>); MSE=Bias²+Var; ARE=</w:t>
-      </w:r>
-      <w:proofErr w:type="gramStart"/>
-      <w:r>
-        <w:rPr>
-          <w:rFonts w:eastAsia="Arial"/>
-        </w:rPr>
-        <w:t>Var(</w:t>
-      </w:r>
-      <w:proofErr w:type="gramEnd"/>
-      <w:r>
-        <w:rPr>
-          <w:rFonts w:eastAsia="Arial"/>
-        </w:rPr>
-        <w:t>OLS)/Var(</w:t>
-      </w:r>
-      <w:r>
-        <w:rPr>
-          <w:rFonts w:eastAsia="Arial"/>
-        </w:rPr>
-        <w:t>method</w:t>
-      </w:r>
-      <w:r>
-        <w:rPr>
-          <w:rFonts w:eastAsia="Arial"/>
-        </w:rPr>
-        <w:t xml:space="preserve">); </w:t>
+        <w:t xml:space="preserve">); MSE=Bias²+Var; ARE=Var(OLS)/Var(method); </w:t>
       </w:r>
       <m:oMath>
         <m:sSub>
@@ -6415,41 +5495,7 @@
         <w:rPr>
           <w:rFonts w:eastAsia="Arial"/>
         </w:rPr>
-        <w:t xml:space="preserve"> </w:t>
-      </w:r>
-      <w:r>
-        <w:rPr>
-          <w:rFonts w:eastAsia="Arial"/>
-        </w:rPr>
-        <w:t xml:space="preserve">= </w:t>
-      </w:r>
-      <w:proofErr w:type="gramStart"/>
-      <w:r>
-        <w:rPr>
-          <w:rFonts w:eastAsia="Arial"/>
-        </w:rPr>
-        <w:t>Var(</w:t>
-      </w:r>
-      <w:proofErr w:type="gramEnd"/>
-      <w:r>
-        <w:rPr>
-          <w:rFonts w:eastAsia="Arial"/>
-        </w:rPr>
-        <w:t>PMM3)/</w:t>
-      </w:r>
-      <w:proofErr w:type="gramStart"/>
-      <w:r>
-        <w:rPr>
-          <w:rFonts w:eastAsia="Arial"/>
-        </w:rPr>
-        <w:t>Var(</w:t>
-      </w:r>
-      <w:proofErr w:type="gramEnd"/>
-      <w:r>
-        <w:rPr>
-          <w:rFonts w:eastAsia="Arial"/>
-        </w:rPr>
-        <w:t>OLS).</w:t>
+        <w:t xml:space="preserve"> = Var(PMM3)/Var(OLS).</w:t>
       </w:r>
     </w:p>
     <w:p>
@@ -6459,30 +5505,10 @@
       <w:r>
         <w:t xml:space="preserve">The results for all 24 scenarios are summarised in Figs. 2 and 3; the full numeric table is provided as supplementary material.</w:t>
       </w:r>
-      <w:proofErr w:type="spellStart"/>
-      <w:proofErr w:type="spellEnd"/>
     </w:p>
     <w:p>
       <w:r>
-        <w:t xml:space="preserve">Here</w:t>
-      </w:r>
-      <w:r>
-        <w:t xml:space="preserve"> </w:t>
-      </w:r>
-      <w:r>
-        <w:t xml:space="preserve">ARE &gt; 1 </w:t>
-      </w:r>
-      <w:r>
-        <w:t>indicates superiority over OLS.</w:t>
-      </w:r>
-      <w:r>
-        <w:t xml:space="preserve"> </w:t>
-      </w:r>
-      <w:r>
-        <w:t>Furthermore</w:t>
-      </w:r>
-      <w:r>
-        <w:t xml:space="preserve"> </w:t>
+        <w:t xml:space="preserve">Here ARE &gt; 1 indicates superiority over OLS. Furthermore </w:t>
       </w:r>
       <m:oMath>
         <m:sSub>
@@ -6521,29 +5547,7 @@
         </m:r>
       </m:oMath>
       <w:r>
-        <w:t xml:space="preserve"> = </w:t>
-      </w:r>
-      <w:proofErr w:type="gramStart"/>
-      <w:r>
-        <w:t>Var(</w:t>
-      </w:r>
-      <w:proofErr w:type="gramEnd"/>
-      <w:r>
-        <w:t>PMM3)/</w:t>
-      </w:r>
-      <w:proofErr w:type="gramStart"/>
-      <w:r>
-        <w:t>Var(</w:t>
-      </w:r>
-      <w:proofErr w:type="gramEnd"/>
-      <w:r>
-        <w:t>OLS)</w:t>
-      </w:r>
-      <w:r>
-        <w:t>,</w:t>
-      </w:r>
-      <w:r>
-        <w:t xml:space="preserve"> </w:t>
+        <w:t xml:space="preserve"> = Var(PMM3)/Var(OLS), </w:t>
       </w:r>
       <m:oMath>
         <m:r>
@@ -6773,13 +5777,7 @@
         </m:f>
       </m:oMath>
       <w:r>
-        <w:t xml:space="preserve">. </w:t>
-      </w:r>
-      <w:r>
-        <w:t>For</w:t>
-      </w:r>
-      <w:r>
-        <w:t xml:space="preserve"> </w:t>
+        <w:t xml:space="preserve">. For </w:t>
       </w:r>
       <m:oMath>
         <m:r>
@@ -6799,10 +5797,7 @@
         </m:r>
       </m:oMath>
       <w:r>
-        <w:t xml:space="preserve"> </w:t>
-      </w:r>
-      <w:r>
-        <w:t xml:space="preserve">the deviation remains within </w:t>
+        <w:t xml:space="preserve"> the deviation remains within </w:t>
       </w:r>
       <m:oMath>
         <m:r>
@@ -6829,7 +5824,7 @@
         </w:rPr>
         <w:drawing>
           <wp:inline distT="0" distB="0" distL="0" distR="0" wp14:anchorId="347E81B5" wp14:editId="7CFD0E7B">
-            <wp:extent cx="3600000" cy="1946541"/>
+            <wp:extent cx="3600000" cy="1960094"/>
             <wp:effectExtent l="0" t="0" r="0" b="0"/>
             <wp:docPr id="3" name="Рисунок 3"/>
             <wp:cNvGraphicFramePr>
@@ -6845,7 +5840,7 @@
                   <pic:blipFill rotWithShape="1">
                     <a:blip r:embed="rId19" cstate="print">
                       <a:extLst>
-                        <a:ext uri="{28A0092B-C50C-407E-A947-70E740481C1C}" cx="3600000" cy="1946541">
+                        <a:ext uri="{28A0092B-C50C-407E-A947-70E740481C1C}" cx="3600000" cy="1960094">
                           <a14:useLocalDpi xmlns:a14="http://schemas.microsoft.com/office/drawing/2010/main" val="0"/>
                         </a:ext>
                       </a:extLst>
@@ -6857,7 +5852,7 @@
                   <pic:spPr bwMode="auto">
                     <a:xfrm>
                       <a:off x="0" y="0"/>
-                      <a:ext cx="3600000" cy="1946541"/>
+                      <a:ext cx="3600000" cy="1960094"/>
                     </a:xfrm>
                     <a:prstGeom prst="rect">
                       <a:avLst/>
@@ -6866,7 +5861,7 @@
                       <a:noFill/>
                     </a:ln>
                     <a:extLst>
-                      <a:ext uri="{53640926-AAD7-44D8-BBD7-CCE9431645EC}" cx="3600000" cy="1946541">
+                      <a:ext uri="{53640926-AAD7-44D8-BBD7-CCE9431645EC}" cx="3600000" cy="1960094">
                         <a14:shadowObscured xmlns:a14="http://schemas.microsoft.com/office/drawing/2010/main"/>
                       </a:ext>
                     </a:extLst>
@@ -6901,7 +5896,7 @@
         </w:rPr>
         <w:drawing>
           <wp:inline distT="0" distB="0" distL="0" distR="0" wp14:anchorId="2BE27D7F" wp14:editId="14BB8933">
-            <wp:extent cx="3600000" cy="2146447"/>
+            <wp:extent cx="3600000" cy="2160000"/>
             <wp:effectExtent l="0" t="0" r="8890" b="0"/>
             <wp:docPr id="1292032532" name="Рисунок 1"/>
             <wp:cNvGraphicFramePr>
@@ -6923,7 +5918,7 @@
                   <pic:spPr>
                     <a:xfrm>
                       <a:off x="0" y="0"/>
-                      <a:ext cx="3600000" cy="2146447"/>
+                      <a:ext cx="3600000" cy="2160000"/>
                     </a:xfrm>
                     <a:prstGeom prst="rect">
                       <a:avLst/>
@@ -6975,13 +5970,7 @@
         </m:r>
       </m:oMath>
       <w:r>
-        <w:t>: ARE ranging from 1.5 to 23.8 – the theory has been confirmed.</w:t>
-      </w:r>
-      <w:r>
-        <w:t xml:space="preserve"> </w:t>
-      </w:r>
-      <w:r>
-        <w:t xml:space="preserve">MLE-TN is even more effective than PMM3 for </w:t>
+        <w:t xml:space="preserve">: ARE ranging from 1.5 to 23.8 – the theory has been confirmed. MLE-TN is even more effective than PMM3 for </w:t>
       </w:r>
       <m:oMath>
         <m:r>
@@ -6992,10 +5981,7 @@
         </m:r>
       </m:oMath>
       <w:r>
-        <w:t xml:space="preserve"> </w:t>
-      </w:r>
-      <w:r>
-        <w:t xml:space="preserve">(assuming the TN specification is correct), but it estimates </w:t>
+        <w:t xml:space="preserve"> (assuming the TN specification is correct), but it estimates </w:t>
       </w:r>
       <m:oMath>
         <m:r>
@@ -7006,19 +5992,7 @@
         </m:r>
       </m:oMath>
       <w:r>
-        <w:t xml:space="preserve"> parameters </w:t>
-      </w:r>
-      <w:r>
-        <w:t>–</w:t>
-      </w:r>
-      <w:r>
-        <w:t xml:space="preserve"> excessive parameterization for small n.</w:t>
-      </w:r>
-      <w:r>
-        <w:t xml:space="preserve"> </w:t>
-      </w:r>
-      <w:r>
-        <w:t xml:space="preserve">The empirical efficiency coefficient </w:t>
+        <w:t xml:space="preserve"> parameters – excessive parameterization for small n. The empirical efficiency coefficient </w:t>
       </w:r>
       <m:oMath>
         <m:sSub>
@@ -7055,10 +6029,7 @@
         </m:r>
       </m:oMath>
       <w:r>
-        <w:t xml:space="preserve"> </w:t>
-      </w:r>
-      <w:r>
-        <w:t xml:space="preserve">approximates its theoretical value </w:t>
+        <w:t xml:space="preserve"> approximates its theoretical value </w:t>
       </w:r>
       <m:oMath>
         <m:sSub>
@@ -7095,19 +6066,7 @@
         </m:r>
       </m:oMath>
       <w:r>
-        <w:t xml:space="preserve"> </w:t>
-      </w:r>
-      <w:r>
-        <w:t xml:space="preserve">with an accuracy of approximately </w:t>
-      </w:r>
-      <w:r>
-        <w:t xml:space="preserve">±10% for </w:t>
-      </w:r>
-      <w:r>
-        <w:t>sufficient</w:t>
-      </w:r>
-      <w:r>
-        <w:t xml:space="preserve"> sample sizes (</w:t>
+        <w:t xml:space="preserve"> with an accuracy of approximately ±10% for sufficient sample sizes (</w:t>
       </w:r>
       <m:oMath>
         <m:r>
@@ -7118,16 +6077,7 @@
         </m:r>
       </m:oMath>
       <w:r>
-        <w:t xml:space="preserve">).</w:t>
-      </w:r>
-      <w:r>
-        <w:t xml:space="preserve"> </w:t>
-      </w:r>
-      <w:r>
-        <w:t>For the most challenging scenario,</w:t>
-      </w:r>
-      <w:r>
-        <w:t xml:space="preserve"> </w:t>
+        <w:t xml:space="preserve">). For the most challenging scenario, </w:t>
       </w:r>
       <m:oMath>
         <m:r>
@@ -7149,33 +6099,7 @@
         </m:r>
       </m:oMath>
       <w:r>
-        <w:t xml:space="preserve">, </w:t>
-      </w:r>
-      <w:r>
-        <w:t>the efficiencies were</w:t>
-      </w:r>
-      <w:r>
-        <w:t xml:space="preserve"> </w:t>
-      </w:r>
-      <w:r>
-        <w:t xml:space="preserve">ARE(PMM3) = 23.8 </w:t>
-      </w:r>
-      <w:r>
-        <w:t xml:space="preserve">compared with </w:t>
-      </w:r>
-      <w:r>
-        <w:t>ARE(MLE-TN) = 27.4</w:t>
-      </w:r>
-      <w:r>
-        <w:t xml:space="preserve">. Thus, PMM3 </w:t>
-      </w:r>
-      <w:proofErr w:type="gramStart"/>
-      <w:r>
-        <w:t>lags behind</w:t>
-      </w:r>
-      <w:proofErr w:type="gramEnd"/>
-      <w:r>
-        <w:t xml:space="preserve"> MLE-TN by only about 15%, while requiring no prior knowledge of the underlying error distribution.</w:t>
+        <w:t xml:space="preserve">, the efficiencies were ARE(PMM3) = 23.8 compared with ARE(MLE-TN) = 27.4. Thus, PMM3 lags behind MLE-TN by only about 15%, while requiring no prior knowledge of the underlying error distribution.</w:t>
       </w:r>
     </w:p>
     <w:p>
@@ -7183,10 +6107,7 @@
         <w:pStyle w:val="heading2"/>
       </w:pPr>
       <w:r>
-        <w:t xml:space="preserve">Real-world data: Fisher's iris dataset </w:t>
-      </w:r>
-      <w:r>
-        <w:t>(Iris versicolor)</w:t>
+        <w:t xml:space="preserve">Real-world data: Fisher's iris dataset (Iris versicolor)</w:t>
       </w:r>
     </w:p>
     <w:p>
@@ -7194,10 +6115,7 @@
         <w:pStyle w:val="p1a"/>
       </w:pPr>
       <w:r>
-        <w:t>A subset of the classical Fisher Iris dataset [3] corresponding to the species Iris versicolor was used for empirical evaluation. The dataset contains</w:t>
-      </w:r>
-      <w:r>
-        <w:t xml:space="preserve"> </w:t>
+        <w:t xml:space="preserve">A subset of the classical Fisher Iris dataset [3] corresponding to the species Iris versicolor was used for empirical evaluation. The dataset contains </w:t>
       </w:r>
       <m:oMath>
         <m:r>
@@ -7208,13 +6126,7 @@
         </m:r>
       </m:oMath>
       <w:r>
-        <w:t xml:space="preserve"> </w:t>
-      </w:r>
-      <w:r>
-        <w:t>observations</w:t>
-      </w:r>
-      <w:r>
-        <w:t>.</w:t>
+        <w:t xml:space="preserve"> observations.</w:t>
       </w:r>
     </w:p>
     <w:p>
@@ -7428,8 +6340,6 @@
       </m:oMath>
       <w:r>
         <w:t>.</w:t>
-      </w:r>
-      <w:r>
         <w:tab/>
         <w:t>(</w:t>
       </w:r>
@@ -7453,19 +6363,7 @@
         <w:rPr>
           <w:rFonts w:eastAsia="Arial"/>
         </w:rPr>
-        <w:t>OLS Residual Diagnostics</w:t>
-      </w:r>
-      <w:r>
-        <w:rPr>
-          <w:rFonts w:eastAsia="Arial"/>
-        </w:rPr>
-        <w:t>:</w:t>
-      </w:r>
-      <w:r>
-        <w:rPr>
-          <w:rFonts w:eastAsia="Arial"/>
-        </w:rPr>
-        <w:t xml:space="preserve"> </w:t>
+        <w:t xml:space="preserve">OLS Residual Diagnostics: </w:t>
       </w:r>
       <m:oMath>
         <m:r>
@@ -7476,10 +6374,7 @@
         </m:r>
       </m:oMath>
       <w:r>
-        <w:t>;</w:t>
-      </w:r>
-      <w:r>
-        <w:t xml:space="preserve"> </w:t>
+        <w:t xml:space="preserve">; </w:t>
       </w:r>
       <m:oMath>
         <m:sSub>
@@ -7528,22 +6423,7 @@
         </m:r>
       </m:oMath>
       <w:r>
-        <w:t xml:space="preserve"> </w:t>
-      </w:r>
-      <w:r>
-        <w:t>(</w:t>
-      </w:r>
-      <w:r>
-        <w:t>indicating only negligible asymmetry</w:t>
-      </w:r>
-      <w:r>
-        <w:t>)</w:t>
-      </w:r>
-      <w:r>
-        <w:t>;</w:t>
-      </w:r>
-      <w:r>
-        <w:t xml:space="preserve"> </w:t>
+        <w:t xml:space="preserve"> (indicating only negligible asymmetry); </w:t>
       </w:r>
       <m:oMath>
         <m:sSub>
@@ -7592,27 +6472,7 @@
         </m:r>
       </m:oMath>
       <w:r>
-        <w:t xml:space="preserve"> </w:t>
-      </w:r>
-      <w:r>
-        <w:t>(</w:t>
-      </w:r>
-      <w:r>
-        <w:t xml:space="preserve">indicates pronounced </w:t>
-      </w:r>
-      <w:proofErr w:type="spellStart"/>
-      <w:r>
-        <w:t>platykurticity</w:t>
-      </w:r>
-      <w:proofErr w:type="spellEnd"/>
-      <w:r>
-        <w:t>)</w:t>
-      </w:r>
-      <w:r>
-        <w:t>;</w:t>
-      </w:r>
-      <w:r>
-        <w:t xml:space="preserve"> </w:t>
+        <w:t xml:space="preserve"> (indicates pronounced platykurticity); </w:t>
       </w:r>
       <m:oMath>
         <m:r>
@@ -7623,19 +6483,7 @@
         </m:r>
       </m:oMath>
       <w:r>
-        <w:t xml:space="preserve"> </w:t>
-      </w:r>
-      <w:r>
-        <w:t>–</w:t>
-      </w:r>
-      <w:r>
-        <w:t xml:space="preserve"> </w:t>
-      </w:r>
-      <w:r>
-        <w:t>suggesting a restricted measurement range</w:t>
-      </w:r>
-      <w:r>
-        <w:t>.</w:t>
+        <w:t xml:space="preserve"> – suggesting a restricted measurement range.</w:t>
       </w:r>
     </w:p>
     <w:p>
@@ -7648,10 +6496,7 @@
     </w:p>
     <w:p>
       <w:r>
-        <w:t>The corresponding theoretical efficiency is</w:t>
-      </w:r>
-      <w:r>
-        <w:t xml:space="preserve">: </w:t>
+        <w:t xml:space="preserve">The corresponding theoretical efficiency is: </w:t>
       </w:r>
       <m:oMath>
         <m:sSub>
@@ -7714,7 +6559,7 @@
           <w:rPr>
             <w:rFonts w:ascii="Cambria Math" w:hAnsi="Cambria Math"/>
           </w:rPr>
-          <m:t>0.517</m:t>
+          <m:t>0.483</m:t>
         </m:r>
       </m:oMath>
       <w:r>
@@ -7724,19 +6569,7 @@
         <w:t xml:space="preserve"> </w:t>
       </w:r>
       <w:r>
-        <w:t>which corresponds to a 51.7% reduction in variance</w:t>
-      </w:r>
-      <w:r>
-        <w:t>.</w:t>
-      </w:r>
-      <w:r>
-        <w:t xml:space="preserve"> </w:t>
-      </w:r>
-      <w:r>
-        <w:t>Based on the residual diagnostics</w:t>
-      </w:r>
-      <w:r>
-        <w:t xml:space="preserve">: </w:t>
+        <w:t xml:space="preserve">which corresponds to a 51.7% reduction in variance. Based on the residual diagnostics: </w:t>
       </w:r>
       <m:oMath>
         <m:sSub>
@@ -7773,16 +6606,7 @@
         </m:r>
       </m:oMath>
       <w:r>
-        <w:t xml:space="preserve"> </w:t>
-      </w:r>
-      <w:r>
-        <w:t>PMM3</w:t>
-      </w:r>
-      <w:r>
-        <w:t xml:space="preserve"> is recommended</w:t>
-      </w:r>
-      <w:r>
-        <w:t>.</w:t>
+        <w:t xml:space="preserve"> PMM3 is recommended.</w:t>
       </w:r>
     </w:p>
     <w:p>
@@ -7794,23 +6618,8 @@
           <w:b/>
         </w:rPr>
         <w:t xml:space="preserve">Table </w:t>
-      </w:r>
-      <w:r>
-        <w:rPr>
-          <w:b/>
-        </w:rPr>
         <w:fldChar w:fldCharType="begin"/>
-      </w:r>
-      <w:r>
-        <w:rPr>
-          <w:b/>
-        </w:rPr>
         <w:instrText xml:space="preserve"> SEQ "Table" \* MERGEFORMAT </w:instrText>
-      </w:r>
-      <w:r>
-        <w:rPr>
-          <w:b/>
-        </w:rPr>
         <w:fldChar w:fldCharType="separate"/>
       </w:r>
       <w:r>
@@ -7825,21 +6634,10 @@
           <w:b/>
         </w:rPr>
         <w:fldChar w:fldCharType="end"/>
-      </w:r>
-      <w:r>
-        <w:rPr>
-          <w:b/>
-        </w:rPr>
         <w:t>.</w:t>
       </w:r>
       <w:r>
-        <w:t xml:space="preserve"> </w:t>
-      </w:r>
-      <w:r>
-        <w:t>Comparison of estimation methods for iris versicolor</w:t>
-      </w:r>
-      <w:r>
-        <w:t xml:space="preserve"> (</w:t>
+        <w:t xml:space="preserve"> Comparison of estimation methods for iris versicolor (</w:t>
       </w:r>
       <m:oMath>
         <m:r>
@@ -8019,25 +6817,7 @@
               <w:rPr>
                 <w:sz w:val="18"/>
               </w:rPr>
-              <w:t xml:space="preserve"> </w:t>
-            </w:r>
-            <w:r>
-              <w:rPr>
-                <w:sz w:val="18"/>
-              </w:rPr>
-              <w:t>(</w:t>
-            </w:r>
-            <w:r>
-              <w:rPr>
-                <w:sz w:val="18"/>
-              </w:rPr>
-              <w:t>bootstrap</w:t>
-            </w:r>
-            <w:r>
-              <w:rPr>
-                <w:sz w:val="18"/>
-              </w:rPr>
-              <w:t>)</w:t>
+              <w:t xml:space="preserve"> (bootstrap)</w:t>
             </w:r>
           </w:p>
         </w:tc>
@@ -8115,19 +6895,7 @@
               <w:rPr>
                 <w:sz w:val="18"/>
               </w:rPr>
-              <w:t>1.000 (</w:t>
-            </w:r>
-            <w:r>
-              <w:rPr>
-                <w:sz w:val="18"/>
-              </w:rPr>
-              <w:t>baseline</w:t>
-            </w:r>
-            <w:r>
-              <w:rPr>
-                <w:sz w:val="18"/>
-              </w:rPr>
-              <w:t>)</w:t>
+              <w:t>1.000 (baseline)</w:t>
             </w:r>
           </w:p>
         </w:tc>
@@ -8291,10 +7059,7 @@
     </w:tbl>
     <w:p>
       <w:r>
-        <w:t>The relative variance is computed as</w:t>
-      </w:r>
-      <w:r>
-        <w:t xml:space="preserve"> </w:t>
+        <w:t xml:space="preserve">The relative variance is computed as </w:t>
       </w:r>
       <m:oMath>
         <m:sSub>
@@ -8348,53 +7113,21 @@
         <w:rPr>
           <w:rFonts w:eastAsia="Arial"/>
         </w:rPr>
-        <w:t>)/</w:t>
-      </w:r>
-      <w:proofErr w:type="gramStart"/>
+        <w:t xml:space="preserve">)/Var(OLS) using bootstrap estimation with </w:t>
+      </w:r>
+      <m:oMath>
+        <m:r>
+          <w:rPr>
+            <w:rFonts w:ascii="Cambria Math" w:eastAsia="Arial" w:hAnsi="Cambria Math"/>
+          </w:rPr>
+          <m:t>B=2000</m:t>
+        </m:r>
+      </m:oMath>
       <w:r>
         <w:rPr>
           <w:rFonts w:eastAsia="Arial"/>
         </w:rPr>
-        <w:t>Var(</w:t>
-      </w:r>
-      <w:proofErr w:type="gramEnd"/>
-      <w:r>
-        <w:rPr>
-          <w:rFonts w:eastAsia="Arial"/>
-        </w:rPr>
-        <w:t xml:space="preserve">OLS) </w:t>
-      </w:r>
-      <w:r>
-        <w:rPr>
-          <w:rFonts w:eastAsia="Arial"/>
-        </w:rPr>
-        <w:t xml:space="preserve">using bootstrap estimation with </w:t>
-      </w:r>
-      <m:oMath>
-        <m:r>
-          <w:rPr>
-            <w:rFonts w:ascii="Cambria Math" w:eastAsia="Arial" w:hAnsi="Cambria Math"/>
-          </w:rPr>
-          <m:t>B=2000</m:t>
-        </m:r>
-      </m:oMath>
-      <w:r>
-        <w:rPr>
-          <w:rFonts w:eastAsia="Arial"/>
-        </w:rPr>
-        <w:t xml:space="preserve"> </w:t>
-      </w:r>
-      <w:r>
-        <w:rPr>
-          <w:rFonts w:eastAsia="Arial"/>
-        </w:rPr>
-        <w:t>replications</w:t>
-      </w:r>
-      <w:r>
-        <w:rPr>
-          <w:rFonts w:eastAsia="Arial"/>
-        </w:rPr>
-        <w:t>.</w:t>
+        <w:t xml:space="preserve"> replications.</w:t>
       </w:r>
     </w:p>
     <w:p>
@@ -8402,40 +7135,7 @@
         <w:pStyle w:val="p1a"/>
       </w:pPr>
       <w:r>
-        <w:t xml:space="preserve"/>
-      </w:r>
-      <w:r>
-        <w:t xml:space="preserve"/>
-      </w:r>
-      <w:r>
-        <w:t>PMM3 achieved the smallest prediction error:</w:t>
-      </w:r>
-      <w:r>
-        <w:t xml:space="preserve"> LOO-MSE = 0.2022</w:t>
-      </w:r>
-      <w:r>
-        <w:t>,</w:t>
-      </w:r>
-      <w:r>
-        <w:t xml:space="preserve"> </w:t>
-      </w:r>
-      <w:r>
-        <w:t xml:space="preserve">which is lower than that obtained by </w:t>
-      </w:r>
-      <w:r>
-        <w:t xml:space="preserve">OLS = 0.2070 </w:t>
-      </w:r>
-      <w:r>
-        <w:t>and</w:t>
-      </w:r>
-      <w:r>
-        <w:t xml:space="preserve"> MLE-TN = 0.2109.</w:t>
-      </w:r>
-      <w:r>
-        <w:t xml:space="preserve"> </w:t>
-      </w:r>
-      <w:r>
-        <w:t xml:space="preserve">Bootstrap analysis indicates a </w:t>
+        <w:t xml:space="preserve">PMM3 achieved the smallest prediction error: LOO-MSE = 0.2022, which is lower than that obtained by OLS = 0.2070 and MLE-TN = 0.2109. Bootstrap analysis indicates a </w:t>
       </w:r>
       <w:r>
         <w:rPr>
@@ -8443,15 +7143,7 @@
           <w:b w:val="0"/>
           <w:bCs w:val="0"/>
         </w:rPr>
-        <w:t>43% reduction in variance</w:t>
-      </w:r>
-      <w:r>
-        <w:rPr>
-          <w:rStyle w:val="a9"/>
-          <w:b w:val="0"/>
-          <w:bCs w:val="0"/>
-        </w:rPr>
-        <w:t xml:space="preserve"> </w:t>
+        <w:t xml:space="preserve">43% reduction in variance </w:t>
       </w:r>
       <m:oMath>
         <m:r>
@@ -8516,13 +7208,7 @@
         </m:r>
       </m:oMath>
       <w:r>
-        <w:t>), this agreement can be considered satisfactory.</w:t>
-      </w:r>
-      <w:r>
-        <w:t xml:space="preserve"> </w:t>
-      </w:r>
-      <w:r>
-        <w:t xml:space="preserve">Despite the additional parameters </w:t>
+        <w:t xml:space="preserve">), this agreement can be considered satisfactory. Despite the additional parameters </w:t>
       </w:r>
       <m:oMath>
         <m:d>
@@ -8564,28 +7250,7 @@
         <w:t>MLE-TN exhibited the poorest performance</w:t>
       </w:r>
       <w:r>
-        <w:t xml:space="preserve">. </w:t>
-      </w:r>
-      <w:r>
-        <w:t xml:space="preserve"/>
-      </w:r>
-      <w:r>
-        <w:t xml:space="preserve"/>
-      </w:r>
-      <w:r>
-        <w:t xml:space="preserve"/>
-      </w:r>
-      <w:r>
-        <w:t xml:space="preserve"/>
-      </w:r>
-      <w:r>
-        <w:t xml:space="preserve"> </w:t>
-      </w:r>
-      <w:r>
-        <w:t>Consequently, for datasets characterized by</w:t>
-      </w:r>
-      <w:r>
-        <w:t xml:space="preserve"> </w:t>
+        <w:t xml:space="preserve">.  Consequently, for datasets characterized by </w:t>
       </w:r>
       <m:oMath>
         <m:r>
@@ -8597,9 +7262,6 @@
       </m:oMath>
       <w:r>
         <w:t xml:space="preserve"> and </w:t>
-      </w:r>
-      <w:r>
-        <w:t xml:space="preserve"/>
       </w:r>
       <m:oMath>
         <m:sSub>
@@ -8635,13 +7297,7 @@
         </m:r>
       </m:oMath>
       <w:r>
-        <w:t xml:space="preserve">, </w:t>
-      </w:r>
-      <w:r>
-        <w:t>PMM3 represents the optimal estimation strategy</w:t>
-      </w:r>
-      <w:r>
-        <w:t>.</w:t>
+        <w:t xml:space="preserve">, PMM3 represents the optimal estimation strategy.</w:t>
       </w:r>
     </w:p>
     <w:p>
@@ -8656,7 +7312,7 @@
           <w:rFonts w:eastAsia="Arial"/>
           <w:b/>
         </w:rPr>
-        <w:t xml:space="preserve">Negative example. For the whiteside dataset (MASS package, household gas consumption versus outdoor temperature, n = 56) the residuals give γ₄ = −0.431, i.e. above the threshold: the theoretical gain is only 8.0% (g₃ theor = 0.920), the bootstrap ratio is g₃ emp = 0.978 and LOO-MSE PMM3/OLS = 0.999. Together with four further real datasets with γ₄ ∈ [−0.54, −0.12], for which g₃ emp ∈ [0.97, 1.03], this supports the empirical threshold γ₄ ≲ −0.7.</w:t>
+        <w:t xml:space="preserve">Negative example. For the whiteside dataset (MASS package, household gas consumption versus outdoor temperature, n = 56) the residuals give γ₄ = −0.431, i.e. above the threshold: the theoretical gain is only 8.0% (g₃ theor = 0.920), the bootstrap ratio is g₃ emp = 0.978 and LOO-MSE PMM3/OLS = 0.999. Five further datasets with γ₄ ∈ [−0.54, −0.12] give g₃ emp ∈ [1.03, 1.36] and LOO-MSE PMM3/OLS ≤ 1.013, i.e. no gain, which supports the threshold γ₄ ≲ −0.7.</w:t>
       </w:r>
     </w:p>
     <w:p>
@@ -8678,13 +7334,7 @@
         <w:ind w:firstLine="0"/>
       </w:pPr>
       <w:r>
-        <w:t xml:space="preserve">Robustness was assessed by generating data from non-TN error distributions (Table 2), with </w:t>
-      </w:r>
-      <w:r>
-        <w:t xml:space="preserve">sample size</w:t>
-      </w:r>
-      <w:r>
-        <w:t xml:space="preserve"> </w:t>
+        <w:t xml:space="preserve">Robustness was assessed by generating data from non-TN error distributions (Table 2), with sample size </w:t>
       </w:r>
       <m:oMath>
         <m:r>
@@ -8695,13 +7345,7 @@
         </m:r>
       </m:oMath>
       <w:r>
-        <w:t xml:space="preserve">, </w:t>
-      </w:r>
-      <w:r>
-        <w:t>number of Monte Carlo replications</w:t>
-      </w:r>
-      <w:r>
-        <w:t xml:space="preserve"> </w:t>
+        <w:t xml:space="preserve">, number of Monte Carlo replications </w:t>
       </w:r>
       <m:oMath>
         <m:r>
@@ -8725,26 +7369,8 @@
           <w:b/>
         </w:rPr>
         <w:t xml:space="preserve">Table </w:t>
-      </w:r>
-      <w:r>
-        <w:rPr>
-          <w:rFonts w:eastAsia="Arial"/>
-          <w:b/>
-        </w:rPr>
         <w:fldChar w:fldCharType="begin"/>
-      </w:r>
-      <w:r>
-        <w:rPr>
-          <w:rFonts w:eastAsia="Arial"/>
-          <w:b/>
-        </w:rPr>
         <w:instrText xml:space="preserve"> SEQ "Table" \* MERGEFORMAT </w:instrText>
-      </w:r>
-      <w:r>
-        <w:rPr>
-          <w:rFonts w:eastAsia="Arial"/>
-          <w:b/>
-        </w:rPr>
         <w:fldChar w:fldCharType="separate"/>
       </w:r>
       <w:r>
@@ -8761,31 +7387,13 @@
           <w:b/>
         </w:rPr>
         <w:fldChar w:fldCharType="end"/>
-      </w:r>
-      <w:r>
-        <w:rPr>
-          <w:rFonts w:eastAsia="Arial"/>
-          <w:b/>
-        </w:rPr>
         <w:t>.</w:t>
       </w:r>
       <w:r>
         <w:rPr>
           <w:rFonts w:eastAsia="Arial"/>
         </w:rPr>
-        <w:t xml:space="preserve"> </w:t>
-      </w:r>
-      <w:r>
-        <w:rPr>
-          <w:rFonts w:eastAsia="Arial"/>
-        </w:rPr>
-        <w:t xml:space="preserve">ARE under model misspecification </w:t>
-      </w:r>
-      <w:r>
-        <w:rPr>
-          <w:rFonts w:eastAsia="Arial"/>
-        </w:rPr>
-        <w:t>(</w:t>
+        <w:t xml:space="preserve"> ARE under model misspecification (</w:t>
       </w:r>
       <m:oMath>
         <m:r>
@@ -8876,25 +7484,7 @@
               <w:rPr>
                 <w:sz w:val="18"/>
               </w:rPr>
-              <w:t xml:space="preserve"> </w:t>
-            </w:r>
-            <w:r>
-              <w:rPr>
-                <w:sz w:val="18"/>
-              </w:rPr>
-              <w:t>(</w:t>
-            </w:r>
-            <w:r>
-              <w:rPr>
-                <w:sz w:val="18"/>
-              </w:rPr>
-              <w:t>true</w:t>
-            </w:r>
-            <w:r>
-              <w:rPr>
-                <w:sz w:val="18"/>
-              </w:rPr>
-              <w:t>)</w:t>
+              <w:t xml:space="preserve"> (true)</w:t>
             </w:r>
           </w:p>
         </w:tc>
@@ -9010,7 +7600,7 @@
               <w:rPr>
                 <w:sz w:val="18"/>
               </w:rPr>
-              <w:t>1.000</w:t>
+              <w:t>2.685</w:t>
             </w:r>
           </w:p>
         </w:tc>
@@ -9088,7 +7678,7 @@
               <w:rPr>
                 <w:sz w:val="18"/>
               </w:rPr>
-              <w:t>1.000</w:t>
+              <w:t>1.061</w:t>
             </w:r>
           </w:p>
         </w:tc>
@@ -9105,14 +7695,12 @@
                 <w:sz w:val="18"/>
               </w:rPr>
             </w:pPr>
-            <w:proofErr w:type="spellStart"/>
             <w:r>
               <w:rPr>
                 <w:sz w:val="18"/>
               </w:rPr>
               <w:t xml:space="preserve">Logistic</w:t>
             </w:r>
-            <w:proofErr w:type="spellEnd"/>
           </w:p>
         </w:tc>
         <w:tc>
@@ -9168,7 +7756,7 @@
               <w:rPr>
                 <w:sz w:val="18"/>
               </w:rPr>
-              <w:t>1.000</w:t>
+              <w:t>1.023</w:t>
             </w:r>
           </w:p>
         </w:tc>
@@ -9247,7 +7835,7 @@
               <w:rPr>
                 <w:sz w:val="18"/>
               </w:rPr>
-              <w:t>1.000</w:t>
+              <w:t>1.047</w:t>
             </w:r>
           </w:p>
         </w:tc>
@@ -9261,51 +7849,7 @@
         </w:rPr>
       </w:pPr>
       <w:r>
-        <w:t>PMM3 is robust, maintaining</w:t>
-      </w:r>
-      <w:r>
-        <w:t xml:space="preserve">: ARE ≈ 1.0 </w:t>
-      </w:r>
-      <w:r>
-        <w:t>for all investigated distributions. Consequently, even when its assumptions are not fully satisfied, PMM3 performs no worse than OLS.</w:t>
-      </w:r>
-      <w:r>
-        <w:t xml:space="preserve"> </w:t>
-      </w:r>
-      <w:r>
-        <w:t>MLE-TN is considerably more sensitive to model misspecification. For example, under the triangular distribution</w:t>
-      </w:r>
-      <w:r>
-        <w:t>,</w:t>
-      </w:r>
-      <w:r>
-        <w:t xml:space="preserve"> ARE = 0.969 </w:t>
-      </w:r>
-      <w:r>
-        <w:t xml:space="preserve">indicating performance that is </w:t>
-      </w:r>
-      <w:proofErr w:type="gramStart"/>
-      <w:r>
-        <w:t>actually inferior</w:t>
-      </w:r>
-      <w:proofErr w:type="gramEnd"/>
-      <w:r>
-        <w:t xml:space="preserve"> to OLS</w:t>
-      </w:r>
-      <w:r>
-        <w:t>.</w:t>
-      </w:r>
-      <w:r>
-        <w:t xml:space="preserve"> </w:t>
-      </w:r>
-      <w:r>
-        <w:t>Therefore, PMM3 should be regarded as the safer estimation method whenever the true error distribution is uncertain.</w:t>
-      </w:r>
-      <w:r>
-        <w:t xml:space="preserve"> </w:t>
-      </w:r>
-      <w:r>
-        <w:t xml:space="preserve">The Newton–Raphson implementation converged in 100% of the 500 replications with no NA outcomes for every λ ∈ {0.8, 1.0, 1.2, 1.5, 2.0, 3.0}, including the strongly bimodal cases, with absolute bias never exceeding 0.022.</w:t>
+        <w:t xml:space="preserve">PMM3 is robust: ARE ≥ 1.02 for all four distributions, so it performs no worse than OLS even when its assumptions fail; for the uniform law (γ₄ = −1.2) it reaches 2.685, above MLE-TN (1.655). MLE-TN is considerably more sensitive to model misspecification. For example, under the triangular distribution, ARE = 0.969 indicating performance that is actually inferior to OLS. Therefore, PMM3 should be regarded as the safer estimation method whenever the true error distribution is uncertain. The Newton–Raphson implementation converged in 100% of the 200 replications with no NA outcomes for every λ ∈ {0.8, 1.0, 1.2, 1.5, 2.0, 3.0}, including the strongly bimodal cases, in 2.8–3.7 iterations on average, with absolute bias below 0.003.</w:t>
       </w:r>
     </w:p>
     <w:p>
@@ -9336,37 +7880,7 @@
         </m:r>
       </m:oMath>
       <w:r>
-        <w:t>.</w:t>
-      </w:r>
-      <w:r>
-        <w:t xml:space="preserve"> </w:t>
-      </w:r>
-      <w:r>
-        <w:t>Under</w:t>
-      </w:r>
-      <w:r>
-        <w:t xml:space="preserve"> </w:t>
-      </w:r>
-      <w:r>
-        <w:t>correct</w:t>
-      </w:r>
-      <w:r>
-        <w:t xml:space="preserve"> </w:t>
-      </w:r>
-      <w:r>
-        <w:t>model</w:t>
-      </w:r>
-      <w:r>
-        <w:t xml:space="preserve"> </w:t>
-      </w:r>
-      <w:r>
-        <w:t>specification,</w:t>
-      </w:r>
-      <w:r>
-        <w:t xml:space="preserve"> </w:t>
-      </w:r>
-      <w:r>
-        <w:t xml:space="preserve">MLE-TN can achieve an even greater efficiency gain; however, it requires estimation of </w:t>
+        <w:t xml:space="preserve">. Under correct model specification, MLE-TN can achieve an even greater efficiency gain; however, it requires estimation of </w:t>
       </w:r>
       <m:oMath>
         <m:r>
@@ -9377,24 +7891,7 @@
         </m:r>
       </m:oMath>
       <w:r>
-        <w:t xml:space="preserve"> </w:t>
-      </w:r>
-      <w:r>
-        <w:t>parameters.</w:t>
-      </w:r>
-      <w:r>
-        <w:t xml:space="preserve"> </w:t>
-      </w:r>
-      <w:r>
-        <w:t xml:space="preserve">Monte Carlo </w:t>
-      </w:r>
-      <w:proofErr w:type="gramStart"/>
-      <w:r>
-        <w:t>study</w:t>
-      </w:r>
-      <w:proofErr w:type="gramEnd"/>
-      <w:r>
-        <w:t xml:space="preserve">. MLE-TN is substantially more efficient than PMM3 for large values of </w:t>
+        <w:t xml:space="preserve"> parameters. Monte Carlo study. MLE-TN is substantially more efficient than PMM3 for large values of </w:t>
       </w:r>
       <m:oMath>
         <m:r>
@@ -9435,13 +7932,7 @@
         </m:sSub>
       </m:oMath>
       <w:r>
-        <w:t xml:space="preserve"> </w:t>
-      </w:r>
-      <w:r>
-        <w:t>of PMM3 converges to its theoretical value for sample sizes of approximately</w:t>
-      </w:r>
-      <w:r>
-        <w:t xml:space="preserve"> </w:t>
+        <w:t xml:space="preserve"> of PMM3 converges to its theoretical value for sample sizes of approximately </w:t>
       </w:r>
       <m:oMath>
         <m:r>
@@ -9460,25 +7951,7 @@
         <w:pStyle w:val="numitem"/>
       </w:pPr>
       <w:r>
-        <w:t>Robustness</w:t>
-      </w:r>
-      <w:r>
-        <w:t xml:space="preserve">. </w:t>
-      </w:r>
-      <w:r>
-        <w:t>PMM3 consistently maintains</w:t>
-      </w:r>
-      <w:r>
-        <w:t xml:space="preserve"> ARE ≈ 1 </w:t>
-      </w:r>
-      <w:r>
-        <w:t>under model misspecification, whereas MLE-TN may perform worse than OLS.</w:t>
-      </w:r>
-      <w:r>
-        <w:t xml:space="preserve"> </w:t>
-      </w:r>
-      <w:r>
-        <w:t xml:space="preserve">PMM3 is therefore the safe choice when the error distribution is uncertain.</w:t>
+        <w:t xml:space="preserve">Robustness. PMM3 never falls below OLS under model misspecification (ARE from 1.02 to 2.68), whereas MLE-TN may perform worse than OLS. PMM3 is therefore the safe choice when the error distribution is uncertain.</w:t>
       </w:r>
     </w:p>
     <w:p>
@@ -9486,10 +7959,7 @@
         <w:pStyle w:val="numitem"/>
       </w:pPr>
       <w:r>
-        <w:t xml:space="preserve">Real-world data. For the Iris versicolor dataset </w:t>
-      </w:r>
-      <w:r>
-        <w:t xml:space="preserve">( </w:t>
+        <w:t xml:space="preserve">Real-world data. For the Iris versicolor dataset ( </w:t>
       </w:r>
       <m:oMath>
         <m:sSub>
@@ -9536,22 +8006,7 @@
         </m:r>
       </m:oMath>
       <w:r>
-        <w:t>)</w:t>
-      </w:r>
-      <w:r>
-        <w:t xml:space="preserve"> </w:t>
-      </w:r>
-      <w:r>
-        <w:t>PMM3 achieves a 43% reduction in variance, while its predictive performance satisfies</w:t>
-      </w:r>
-      <w:r>
-        <w:t xml:space="preserve"> </w:t>
-      </w:r>
-      <w:r>
-        <w:t>LOO-MSE PMM3 &lt; OLS &lt; MLE-TN</w:t>
-      </w:r>
-      <w:r>
-        <w:t>.</w:t>
+        <w:t xml:space="preserve">) PMM3 achieves a 43% reduction in variance, while its predictive performance satisfies LOO-MSE PMM3 &lt; OLS &lt; MLE-TN.</w:t>
       </w:r>
     </w:p>
     <w:p>
@@ -9595,13 +8050,7 @@
         </m:r>
       </m:oMath>
       <w:r>
-        <w:t xml:space="preserve">. </w:t>
-      </w:r>
-      <w:r>
-        <w:t>For</w:t>
-      </w:r>
-      <w:r>
-        <w:t xml:space="preserve"> −0.7 &lt; </w:t>
+        <w:t xml:space="preserve">. For −0.7 &lt; </w:t>
       </w:r>
       <m:oMath>
         <m:sSub>
@@ -9631,19 +8080,7 @@
         </m:sSub>
       </m:oMath>
       <w:r>
-        <w:t xml:space="preserve"> &lt; 0 </w:t>
-      </w:r>
-      <w:r>
-        <w:t>all three methods are, for practical purposes, equivalent to OLS</w:t>
-      </w:r>
-      <w:r>
-        <w:tab/>
-      </w:r>
-      <w:r>
-        <w:t>.</w:t>
-      </w:r>
-      <w:r>
-        <w:t xml:space="preserve"> In practice: prefer MLE-TN when the TN model is justified and n is large, PMM3 when the error distribution is uncertain, and OLS for approximately Gaussian errors.</w:t>
+        <w:t xml:space="preserve"> &lt; 0 no method offers a practical advantage over OLS (prediction error within 2% of OLS). In practice: prefer MLE-TN when the TN model is justified and n is large, PMM3 when the error distribution is uncertain, and OLS for approximately Gaussian errors.</w:t>
       </w:r>
     </w:p>
     <w:p>
@@ -9663,13 +8100,8 @@
       <w:pPr>
         <w:pStyle w:val="referenceitem"/>
       </w:pPr>
-      <w:proofErr w:type="spellStart"/>
-      <w:r>
-        <w:t>Andargie</w:t>
-      </w:r>
-      <w:proofErr w:type="spellEnd"/>
-      <w:r>
-        <w:t xml:space="preserve">, A.A., Rao, K.S.: Estimation of a linear model with two-parameter symmetric platykurtic distributed errors. J. Uncertain. Anal. Appl. </w:t>
+      <w:r>
+        <w:t xml:space="preserve">Andargie, A.A., Rao, K.S.: Estimation of a linear model with two-parameter symmetric platykurtic distributed errors. J. Uncertain. Anal. Appl. </w:t>
       </w:r>
       <w:r>
         <w:rPr>
@@ -9678,18 +8110,7 @@
         <w:t>1</w:t>
       </w:r>
       <w:r>
-        <w:t xml:space="preserve">, 13 (2013). </w:t>
-      </w:r>
-      <w:proofErr w:type="spellStart"/>
-      <w:r>
-        <w:t>doi</w:t>
-      </w:r>
-      <w:proofErr w:type="spellEnd"/>
-      <w:r>
-        <w:t>: 10.1186/2195-5468-1-13</w:t>
-      </w:r>
-      <w:r>
-        <w:t>.</w:t>
+        <w:t xml:space="preserve">, 13 (2013). doi: 10.1186/2195-5468-1-13.</w:t>
       </w:r>
     </w:p>
     <w:p>
@@ -9724,23 +8145,7 @@
         <w:pStyle w:val="referenceitem"/>
       </w:pPr>
       <w:r>
-        <w:t xml:space="preserve">Ganguly, S.S.: Robust regression analysis for non-normal situations under symmetric distributions arising in medical research. J. Mod. Appl. Stat. Methods 13(1), 446–462 (2014). </w:t>
-      </w:r>
-      <w:proofErr w:type="spellStart"/>
-      <w:r>
-        <w:t>doi</w:t>
-      </w:r>
-      <w:proofErr w:type="spellEnd"/>
-      <w:r>
-        <w:t>: 10.22237/</w:t>
-      </w:r>
-      <w:proofErr w:type="spellStart"/>
-      <w:r>
-        <w:t>jmasm</w:t>
-      </w:r>
-      <w:proofErr w:type="spellEnd"/>
-      <w:r>
-        <w:t>/1398918480.</w:t>
+        <w:t xml:space="preserve">Ganguly, S.S.: Robust regression analysis for non-normal situations under symmetric distributions arising in medical research. J. Mod. Appl. Stat. Methods 13(1), 446–462 (2014). doi: 10.22237/jmasm/1398918480.</w:t>
       </w:r>
     </w:p>
     <w:p>
@@ -9748,15 +8153,7 @@
         <w:pStyle w:val="referenceitem"/>
       </w:pPr>
       <w:r>
-        <w:t xml:space="preserve">Gauss, C. F. Theoria Motus </w:t>
-      </w:r>
-      <w:proofErr w:type="spellStart"/>
-      <w:r>
-        <w:t>Corporum</w:t>
-      </w:r>
-      <w:proofErr w:type="spellEnd"/>
-      <w:r>
-        <w:t xml:space="preserve"> Coelestium. Perthes and Besser: Hamburg, 1809.</w:t>
+        <w:t xml:space="preserve">Gauss, C. F. Theoria Motus Corporum Coelestium. Perthes and Besser: Hamburg, 1809.</w:t>
       </w:r>
     </w:p>
     <w:p>
@@ -9765,10 +8162,7 @@
       </w:pPr>
       <w:r>
         <w:lastRenderedPageBreak/>
-        <w:t xml:space="preserve">Huber, P.J.: The behavior of maximum likelihood estimates under nonstandard conditions. In: Proc. 5th Berkeley Symp. Math. Statist. Probab., vol. 1, pp. 221–233. Univ. California Press, Berkeley (1967)</w:t>
-      </w:r>
-      <w:r>
-        <w:t>.</w:t>
+        <w:t xml:space="preserve">Huber, P.J.: The behavior of maximum likelihood estimates under nonstandard conditions. In: Proc. 5th Berkeley Symp. Math. Statist. Probab., vol. 1, pp. 221–233. Univ. California Press, Berkeley (1967).</w:t>
       </w:r>
     </w:p>
     <w:p>
@@ -9776,18 +8170,7 @@
         <w:pStyle w:val="referenceitem"/>
       </w:pPr>
       <w:r>
-        <w:t>Jarque, C.M., Bera, A.K.: A test for normality of observations and regression residuals. Int. Stat. Rev. 55(2), 163–172</w:t>
-      </w:r>
-      <w:r>
-        <w:t xml:space="preserve"> (1987). </w:t>
-      </w:r>
-      <w:proofErr w:type="spellStart"/>
-      <w:r>
-        <w:t>doi</w:t>
-      </w:r>
-      <w:proofErr w:type="spellEnd"/>
-      <w:r>
-        <w:t>: 10.2307/1403192.</w:t>
+        <w:t xml:space="preserve">Jarque, C.M., Bera, A.K.: A test for normality of observations and regression residuals. Int. Stat. Rev. 55(2), 163–172 (1987). doi: 10.2307/1403192.</w:t>
       </w:r>
     </w:p>
     <w:p>
@@ -9795,10 +8178,7 @@
         <w:pStyle w:val="referenceitem"/>
       </w:pPr>
       <w:r>
-        <w:t>John, S. The three-parameter two-piece normal family. Communications in S</w:t>
-      </w:r>
-      <w:r>
-        <w:t>tatistics 1982, 11(8), 879–885.</w:t>
+        <w:t>John, S. The three-parameter two-piece normal family. Communications in Statistics 1982, 11(8), 879–885.</w:t>
       </w:r>
     </w:p>
     <w:p>
@@ -9806,15 +8186,7 @@
         <w:pStyle w:val="referenceitem"/>
       </w:pPr>
       <w:r>
-        <w:t xml:space="preserve">Koenker, R., Hallock, K.F.: Quantile regression. J. Econ. </w:t>
-      </w:r>
-      <w:proofErr w:type="spellStart"/>
-      <w:r>
-        <w:t>Perspect</w:t>
-      </w:r>
-      <w:proofErr w:type="spellEnd"/>
-      <w:r>
-        <w:t>. 15(4), 143–156 (2001).</w:t>
+        <w:t xml:space="preserve">Koenker, R., Hallock, K.F.: Quantile regression. J. Econ. Perspect. 15(4), 143–156 (2001).</w:t>
       </w:r>
     </w:p>
     <w:p>
@@ -9822,15 +8194,7 @@
         <w:pStyle w:val="referenceitem"/>
       </w:pPr>
       <w:r>
-        <w:t xml:space="preserve">Kunchenko, Yu. P.; Lega, Yu. G. Polynomial parameter estimation of close to Gaussian random variables. </w:t>
-      </w:r>
-      <w:proofErr w:type="spellStart"/>
-      <w:r>
-        <w:t>Radioelectronics</w:t>
-      </w:r>
-      <w:proofErr w:type="spellEnd"/>
-      <w:r>
-        <w:t xml:space="preserve"> and Communications Systems 1992, 35(8), 76–78.</w:t>
+        <w:t xml:space="preserve">Kunchenko, Yu. P.; Lega, Yu. G. Polynomial parameter estimation of close to Gaussian random variables. Radioelectronics and Communications Systems 1992, 35(8), 76–78.</w:t>
       </w:r>
     </w:p>
     <w:p>
@@ -9838,18 +8202,7 @@
         <w:pStyle w:val="referenceitem"/>
       </w:pPr>
       <w:r>
-        <w:t xml:space="preserve">Leisen, F., Rossini, L., Villa, C.: Loss-based approach to two-piece location-scale distributions with applications to dependent data. Stat. Methods Appl. 29(2), 309–333 (2020). </w:t>
-      </w:r>
-      <w:proofErr w:type="spellStart"/>
-      <w:r>
-        <w:t>doi</w:t>
-      </w:r>
-      <w:proofErr w:type="spellEnd"/>
-      <w:r>
-        <w:t>: 10.1007/s10260-019-00481-x.</w:t>
-      </w:r>
-      <w:r>
-        <w:t xml:space="preserve"> </w:t>
+        <w:t xml:space="preserve">Leisen, F., Rossini, L., Villa, C.: Loss-based approach to two-piece location-scale distributions with applications to dependent data. Stat. Methods Appl. 29(2), 309–333 (2020). doi: 10.1007/s10260-019-00481-x. </w:t>
       </w:r>
     </w:p>
     <w:p>
@@ -9857,15 +8210,7 @@
         <w:pStyle w:val="referenceitem"/>
       </w:pPr>
       <w:r>
-        <w:t xml:space="preserve">Ma, Y., Wang, S., Xu, L., Yao, W.: Semiparametric mixture regression with unspecified error distributions. TEST 30(2), 429–444 (2021). </w:t>
-      </w:r>
-      <w:proofErr w:type="spellStart"/>
-      <w:r>
-        <w:t>doi</w:t>
-      </w:r>
-      <w:proofErr w:type="spellEnd"/>
-      <w:r>
-        <w:t>: 10.1007/s11749-020-00725-z.</w:t>
+        <w:t xml:space="preserve">Ma, Y., Wang, S., Xu, L., Yao, W.: Semiparametric mixture regression with unspecified error distributions. TEST 30(2), 429–444 (2021). doi: 10.1007/s11749-020-00725-z.</w:t>
       </w:r>
     </w:p>
     <w:p>
@@ -9873,15 +8218,7 @@
         <w:pStyle w:val="referenceitem"/>
       </w:pPr>
       <w:r>
-        <w:t xml:space="preserve">Narula, S.C., Wellington, J.F.: The minimum sum of absolute errors regression: a </w:t>
-      </w:r>
-      <w:proofErr w:type="gramStart"/>
-      <w:r>
-        <w:t>state of the art</w:t>
-      </w:r>
-      <w:proofErr w:type="gramEnd"/>
-      <w:r>
-        <w:t xml:space="preserve"> survey. Int. Stat. Rev. 50(3), 317–326 (1982).</w:t>
+        <w:t xml:space="preserve">Narula, S.C., Wellington, J.F.: The minimum sum of absolute errors regression: a state of the art survey. Int. Stat. Rev. 50(3), 317–326 (1982).</w:t>
       </w:r>
     </w:p>
     <w:p>
@@ -9889,23 +8226,7 @@
         <w:pStyle w:val="referenceitem"/>
       </w:pPr>
       <w:r>
-        <w:t xml:space="preserve">Salinas, H., </w:t>
-      </w:r>
-      <w:proofErr w:type="spellStart"/>
-      <w:r>
-        <w:t>Bakouch</w:t>
-      </w:r>
-      <w:proofErr w:type="spellEnd"/>
-      <w:r>
-        <w:t xml:space="preserve">, H., </w:t>
-      </w:r>
-      <w:proofErr w:type="spellStart"/>
-      <w:r>
-        <w:t>Qarmalah</w:t>
-      </w:r>
-      <w:proofErr w:type="spellEnd"/>
-      <w:r>
-        <w:t xml:space="preserve">, N., Martínez-Flórez, G.: A flexible class of two-piece normal distribution with a regression illustration to biaxial fatigue data. Mathematics </w:t>
+        <w:t xml:space="preserve">Salinas, H., Bakouch, H., Qarmalah, N., Martínez-Flórez, G.: A flexible class of two-piece normal distribution with a regression illustration to biaxial fatigue data. Mathematics </w:t>
       </w:r>
       <w:r>
         <w:rPr>
@@ -9914,15 +8235,7 @@
         <w:t>11</w:t>
       </w:r>
       <w:r>
-        <w:t xml:space="preserve">(5), 1271 (2023). </w:t>
-      </w:r>
-      <w:proofErr w:type="spellStart"/>
-      <w:r>
-        <w:t>doi</w:t>
-      </w:r>
-      <w:proofErr w:type="spellEnd"/>
-      <w:r>
-        <w:t>: 10.3390/math11051271.</w:t>
+        <w:t xml:space="preserve">(5), 1271 (2023). doi: 10.3390/math11051271.</w:t>
       </w:r>
     </w:p>
     <w:p>
@@ -9940,26 +8253,7 @@
         <w:t>3</w:t>
       </w:r>
       <w:r>
-        <w:t xml:space="preserve">(2), 267–284 (1975). </w:t>
-      </w:r>
-      <w:proofErr w:type="spellStart"/>
-      <w:r>
-        <w:t>doi</w:t>
-      </w:r>
-      <w:proofErr w:type="spellEnd"/>
-      <w:r>
-        <w:t>: 10.1214/</w:t>
-      </w:r>
-      <w:proofErr w:type="spellStart"/>
-      <w:r>
-        <w:t>aos</w:t>
-      </w:r>
-      <w:proofErr w:type="spellEnd"/>
-      <w:r>
-        <w:t>/1176343056</w:t>
-      </w:r>
-      <w:r>
-        <w:t>.</w:t>
+        <w:t xml:space="preserve">(2), 267–284 (1975). doi: 10.1214/aos/1176343056.</w:t>
       </w:r>
     </w:p>
     <w:p>
@@ -9967,48 +8261,15 @@
         <w:pStyle w:val="referenceitem"/>
       </w:pPr>
       <w:r>
-        <w:t xml:space="preserve">Tiku, M.L., Islam, M.Q., Selçuk, A.S.: Non-normal regression. II. Symmetric distributions. Commun. Stat. </w:t>
-      </w:r>
-      <w:r>
-        <w:t>–</w:t>
-      </w:r>
-      <w:r>
-        <w:t xml:space="preserve"> Theory Methods 30(6), 1021–1045 (2001</w:t>
-      </w:r>
-      <w:r>
-        <w:t>).</w:t>
+        <w:t xml:space="preserve">Tiku, M.L., Islam, M.Q., Selçuk, A.S.: Non-normal regression. II. Symmetric distributions. Commun. Stat. – Theory Methods 30(6), 1021–1045 (2001).</w:t>
       </w:r>
     </w:p>
     <w:p>
       <w:pPr>
         <w:pStyle w:val="referenceitem"/>
       </w:pPr>
-      <w:proofErr w:type="spellStart"/>
-      <w:r>
-        <w:t>Warsza</w:t>
-      </w:r>
-      <w:proofErr w:type="spellEnd"/>
-      <w:r>
-        <w:t xml:space="preserve">, Z.L., Zabolotnii, S.W.: A polynomial estimation of measurand parameters for samples of non-Gaussian symmetrically distributed data. In: Szewczyk, R., Zieliński, C., </w:t>
-      </w:r>
-      <w:proofErr w:type="spellStart"/>
-      <w:r>
-        <w:t>Kaliczyńska</w:t>
-      </w:r>
-      <w:proofErr w:type="spellEnd"/>
-      <w:r>
-        <w:t xml:space="preserve">, M. (eds.) Automation 2017. Adv. Intell. Syst. Comput., vol. 550, pp. 468–480. Springer, Cham (2017). </w:t>
-      </w:r>
-      <w:proofErr w:type="spellStart"/>
-      <w:r>
-        <w:t>doi</w:t>
-      </w:r>
-      <w:proofErr w:type="spellEnd"/>
-      <w:r>
-        <w:t>: 10.1007/978-3-319-54042-9_45</w:t>
-      </w:r>
-      <w:r>
-        <w:t>.</w:t>
+      <w:r>
+        <w:t xml:space="preserve">Warsza, Z.L., Zabolotnii, S.W.: A polynomial estimation of measurand parameters for samples of non-Gaussian symmetrically distributed data. In: Szewczyk, R., Zieliński, C., Kaliczyńska, M. (eds.) Automation 2017. Adv. Intell. Syst. Comput., vol. 550, pp. 468–480. Springer, Cham (2017). doi: 10.1007/978-3-319-54042-9_45.</w:t>
       </w:r>
     </w:p>
     <w:p>
@@ -10016,23 +8277,7 @@
         <w:pStyle w:val="referenceitem"/>
       </w:pPr>
       <w:r>
-        <w:t xml:space="preserve">White, H.: Maximum likelihood estimation of </w:t>
-      </w:r>
-      <w:proofErr w:type="spellStart"/>
-      <w:r>
-        <w:t>misspecified</w:t>
-      </w:r>
-      <w:proofErr w:type="spellEnd"/>
-      <w:r>
-        <w:t xml:space="preserve"> models. </w:t>
-      </w:r>
-      <w:proofErr w:type="spellStart"/>
-      <w:r>
-        <w:t>Econometrica</w:t>
-      </w:r>
-      <w:proofErr w:type="spellEnd"/>
-      <w:r>
-        <w:t xml:space="preserve"> </w:t>
+        <w:t xml:space="preserve">White, H.: Maximum likelihood estimation of misspecified models. Econometrica </w:t>
       </w:r>
       <w:r>
         <w:rPr>
@@ -10042,18 +8287,7 @@
         <w:t>50</w:t>
       </w:r>
       <w:r>
-        <w:t xml:space="preserve">(1), 1–25 (1982). </w:t>
-      </w:r>
-      <w:proofErr w:type="spellStart"/>
-      <w:r>
-        <w:t>doi</w:t>
-      </w:r>
-      <w:proofErr w:type="spellEnd"/>
-      <w:r>
-        <w:t>: 10.2307/1912526</w:t>
-      </w:r>
-      <w:r>
-        <w:t>.</w:t>
+        <w:t xml:space="preserve">(1), 1–25 (1982). doi: 10.2307/1912526.</w:t>
       </w:r>
     </w:p>
     <w:p>
@@ -10061,26 +8295,7 @@
         <w:pStyle w:val="referenceitem"/>
       </w:pPr>
       <w:r>
-        <w:t xml:space="preserve">Zabolotnii, S.W., Warsza, Z.L., Tkachenko, O.: Estimation of linear regression parameters of symmetric non-Gaussian errors by polynomial maximization method. In: Szewczyk, R., Zieliński, C., </w:t>
-      </w:r>
-      <w:proofErr w:type="spellStart"/>
-      <w:r>
-        <w:t>Kaliczyńska</w:t>
-      </w:r>
-      <w:proofErr w:type="spellEnd"/>
-      <w:r>
-        <w:t xml:space="preserve">, M. (eds.) Automation 2019. Adv. Intell. Syst. Comput., vol. 920, pp. 636–649. Springer, Cham (2020). </w:t>
-      </w:r>
-      <w:proofErr w:type="spellStart"/>
-      <w:r>
-        <w:t>doi</w:t>
-      </w:r>
-      <w:proofErr w:type="spellEnd"/>
-      <w:r>
-        <w:t>: 10.1007/978-3-030-13273-6_59</w:t>
-      </w:r>
-      <w:r>
-        <w:t>.</w:t>
+        <w:t xml:space="preserve">Zabolotnii, S.W., Warsza, Z.L., Tkachenko, O.: Estimation of linear regression parameters of symmetric non-Gaussian errors by polynomial maximization method. In: Szewczyk, R., Zieliński, C., Kaliczyńska, M. (eds.) Automation 2019. Adv. Intell. Syst. Comput., vol. 920, pp. 636–649. Springer, Cham (2020). doi: 10.1007/978-3-030-13273-6_59.</w:t>
       </w:r>
     </w:p>
     <w:p>
@@ -10088,26 +8303,7 @@
         <w:pStyle w:val="referenceitem"/>
       </w:pPr>
       <w:r>
-        <w:t xml:space="preserve">Zabolotnii, S.W., Warsza, Z.L., Tkachenko, O.: Polynomial estimation of linear regression parameters for the asymmetric PDF of errors. In: Szewczyk, R., Zieliński, C., </w:t>
-      </w:r>
-      <w:proofErr w:type="spellStart"/>
-      <w:r>
-        <w:t>Kaliczyńska</w:t>
-      </w:r>
-      <w:proofErr w:type="spellEnd"/>
-      <w:r>
-        <w:t xml:space="preserve">, M. (eds.) Automation 2018. Adv. Intell. Syst. Comput., vol. 743, pp. 758–772. Springer, Cham (2018). </w:t>
-      </w:r>
-      <w:proofErr w:type="spellStart"/>
-      <w:r>
-        <w:t>doi</w:t>
-      </w:r>
-      <w:proofErr w:type="spellEnd"/>
-      <w:r>
-        <w:t>: 10.1007/978-3-319-77179-3_75</w:t>
-      </w:r>
-      <w:r>
-        <w:t>.</w:t>
+        <w:t xml:space="preserve">Zabolotnii, S.W., Warsza, Z.L., Tkachenko, O.: Polynomial estimation of linear regression parameters for the asymmetric PDF of errors. In: Szewczyk, R., Zieliński, C., Kaliczyńska, M. (eds.) Automation 2018. Adv. Intell. Syst. Comput., vol. 743, pp. 758–772. Springer, Cham (2018). doi: 10.1007/978-3-319-77179-3_75.</w:t>
       </w:r>
     </w:p>
     <w:p>

</xml_diff>

<commit_message>
fix(paper): equation numbers (1)-(8) and document properties; add co-author letter
Co-Authored-By: Claude Opus 5 (1M context) <noreply@anthropic.com>
</commit_message>
<xml_diff>
--- a/submission/SZabolotnii_ITEST_paper_10p.docx
+++ b/submission/SZabolotnii_ITEST_paper_10p.docx
@@ -1140,7 +1140,7 @@
           <w:rPr>
             <w:noProof/>
           </w:rPr>
-          <w:t>2</w:t>
+          <w:t>1</w:t>
         </w:r>
       </w:fldSimple>
       <w:r>
@@ -1838,7 +1838,7 @@
           <w:rPr>
             <w:noProof/>
           </w:rPr>
-          <w:t>3</w:t>
+          <w:t>2</w:t>
         </w:r>
       </w:fldSimple>
       <w:r>
@@ -2130,7 +2130,7 @@
           <w:rPr>
             <w:noProof/>
           </w:rPr>
-          <w:t>4</w:t>
+          <w:t>3</w:t>
         </w:r>
       </w:fldSimple>
       <w:r>
@@ -2516,7 +2516,7 @@
           <w:rPr>
             <w:noProof/>
           </w:rPr>
-          <w:t>5</w:t>
+          <w:t>4</w:t>
         </w:r>
       </w:fldSimple>
       <w:r>
@@ -3179,7 +3179,7 @@
           <w:rPr>
             <w:noProof/>
           </w:rPr>
-          <w:t>6</w:t>
+          <w:t>5</w:t>
         </w:r>
       </w:fldSimple>
       <w:r>
@@ -4042,7 +4042,7 @@
           <w:rPr>
             <w:noProof/>
           </w:rPr>
-          <w:t>7</w:t>
+          <w:t>6</w:t>
         </w:r>
       </w:fldSimple>
       <w:r>
@@ -5273,7 +5273,7 @@
           <w:rPr>
             <w:noProof/>
           </w:rPr>
-          <w:t>8</w:t>
+          <w:t>7</w:t>
         </w:r>
       </w:fldSimple>
       <w:r>
@@ -6348,7 +6348,7 @@
           <w:rPr>
             <w:noProof/>
           </w:rPr>
-          <w:t>9</w:t>
+          <w:t>8</w:t>
         </w:r>
       </w:fldSimple>
       <w:r>

</xml_diff>

<commit_message>
feat(paper): add Data and Code Availability statement
Open code and results (GitHub + Zenodo DOI) now have their own statement
before the references. Kept to 10 pages by moving the Figs 2-3 discussion
before the figures, shrinking Figs 2-3 to 9.5 cm and dropping a sentence
that repeated the conclusions. The Negative example paragraph no longer
uses a heading style.

Co-Authored-By: Claude Opus 5 (1M context) <noreply@anthropic.com>
</commit_message>
<xml_diff>
--- a/submission/SZabolotnii_ITEST_paper_10p.docx
+++ b/submission/SZabolotnii_ITEST_paper_10p.docx
@@ -5503,7 +5503,7 @@
         <w:pStyle w:val="p1a"/>
       </w:pPr>
       <w:r>
-        <w:t xml:space="preserve">The results for all 24 scenarios are summarised in Figs. 2 and 3; the full numeric table, the code and all stored results are available at https://doi.org/10.5281/zenodo.22849684.</w:t>
+        <w:t xml:space="preserve">The results for all 24 scenarios are summarised in Figs. 2 and 3; the full numeric table is provided in the supplementary material (see Data and Code Availability).</w:t>
       </w:r>
     </w:p>
     <w:p>
@@ -5816,6 +5816,154 @@
     </w:p>
     <w:p>
       <w:pPr>
+        <w:pStyle w:val="p1a"/>
+      </w:pPr>
+      <w:r>
+        <w:t xml:space="preserve">PMM3 significantly outperforms OLS at </w:t>
+      </w:r>
+      <m:oMath>
+        <m:r>
+          <w:rPr>
+            <w:rFonts w:ascii="Cambria Math" w:hAnsi="Cambria Math"/>
+          </w:rPr>
+          <m:t>λ≥1.5</m:t>
+        </m:r>
+      </m:oMath>
+      <w:r>
+        <w:t xml:space="preserve">: ARE ranging from 1.5 to 23.8 – the theory has been confirmed. MLE-TN is even more effective than PMM3 for </w:t>
+      </w:r>
+      <m:oMath>
+        <m:r>
+          <w:rPr>
+            <w:rFonts w:ascii="Cambria Math" w:hAnsi="Cambria Math"/>
+          </w:rPr>
+          <m:t>λ≥1.5</m:t>
+        </m:r>
+      </m:oMath>
+      <w:r>
+        <w:t xml:space="preserve"> (assuming the TN specification is correct), but it estimates </w:t>
+      </w:r>
+      <m:oMath>
+        <m:r>
+          <w:rPr>
+            <w:rFonts w:ascii="Cambria Math" w:hAnsi="Cambria Math"/>
+          </w:rPr>
+          <m:t>p+2</m:t>
+        </m:r>
+      </m:oMath>
+      <w:r>
+        <w:t xml:space="preserve"> parameters – excessive parameterization for small n. The empirical efficiency coefficient </w:t>
+      </w:r>
+      <m:oMath>
+        <m:sSub>
+          <m:sSubPr>
+            <m:ctrlPr>
+              <w:rPr>
+                <w:rFonts w:ascii="Cambria Math" w:hAnsi="Cambria Math"/>
+                <w:i/>
+              </w:rPr>
+            </m:ctrlPr>
+          </m:sSubPr>
+          <m:e>
+            <m:r>
+              <w:rPr>
+                <w:rFonts w:ascii="Cambria Math" w:hAnsi="Cambria Math"/>
+              </w:rPr>
+              <m:t>g</m:t>
+            </m:r>
+          </m:e>
+          <m:sub>
+            <m:r>
+              <w:rPr>
+                <w:rFonts w:ascii="Cambria Math" w:hAnsi="Cambria Math"/>
+              </w:rPr>
+              <m:t>3</m:t>
+            </m:r>
+          </m:sub>
+        </m:sSub>
+        <m:r>
+          <w:rPr>
+            <w:rFonts w:ascii="Cambria Math" w:hAnsi="Cambria Math"/>
+          </w:rPr>
+          <m:t>_emp</m:t>
+        </m:r>
+      </m:oMath>
+      <w:r>
+        <w:t xml:space="preserve"> approximates its theoretical value </w:t>
+      </w:r>
+      <m:oMath>
+        <m:sSub>
+          <m:sSubPr>
+            <m:ctrlPr>
+              <w:rPr>
+                <w:rFonts w:ascii="Cambria Math" w:hAnsi="Cambria Math"/>
+                <w:i/>
+              </w:rPr>
+            </m:ctrlPr>
+          </m:sSubPr>
+          <m:e>
+            <m:r>
+              <w:rPr>
+                <w:rFonts w:ascii="Cambria Math" w:hAnsi="Cambria Math"/>
+              </w:rPr>
+              <m:t>g</m:t>
+            </m:r>
+          </m:e>
+          <m:sub>
+            <m:r>
+              <w:rPr>
+                <w:rFonts w:ascii="Cambria Math" w:hAnsi="Cambria Math"/>
+              </w:rPr>
+              <m:t>3</m:t>
+            </m:r>
+          </m:sub>
+        </m:sSub>
+        <m:r>
+          <w:rPr>
+            <w:rFonts w:ascii="Cambria Math" w:hAnsi="Cambria Math"/>
+          </w:rPr>
+          <m:t>_theor</m:t>
+        </m:r>
+      </m:oMath>
+      <w:r>
+        <w:t xml:space="preserve"> with an accuracy of approximately ±10% for sufficient sample sizes (</w:t>
+      </w:r>
+      <m:oMath>
+        <m:r>
+          <w:rPr>
+            <w:rFonts w:ascii="Cambria Math" w:hAnsi="Cambria Math"/>
+          </w:rPr>
+          <m:t>n≥100</m:t>
+        </m:r>
+      </m:oMath>
+      <w:r>
+        <w:t xml:space="preserve">). For the most challenging scenario, </w:t>
+      </w:r>
+      <m:oMath>
+        <m:r>
+          <w:rPr>
+            <w:rFonts w:ascii="Cambria Math" w:eastAsia="Arial" w:hAnsi="Cambria Math"/>
+          </w:rPr>
+          <m:t>λ=5</m:t>
+        </m:r>
+      </m:oMath>
+      <w:r>
+        <w:t xml:space="preserve">, </w:t>
+      </w:r>
+      <m:oMath>
+        <m:r>
+          <w:rPr>
+            <w:rFonts w:ascii="Cambria Math" w:hAnsi="Cambria Math"/>
+          </w:rPr>
+          <m:t>n=100</m:t>
+        </m:r>
+      </m:oMath>
+      <w:r>
+        <w:t xml:space="preserve">, the efficiencies were ARE(PMM3) = 23.8 compared with ARE(MLE-TN) = 27.4. Thus, PMM3 lags behind MLE-TN by only about 15%, while requiring no prior knowledge of the underlying error distribution.</w:t>
+      </w:r>
+    </w:p>
+    <w:p>
+      <w:pPr>
         <w:pStyle w:val="image"/>
       </w:pPr>
       <w:r>
@@ -5824,7 +5972,7 @@
         </w:rPr>
         <w:drawing>
           <wp:inline distT="0" distB="0" distL="0" distR="0" wp14:anchorId="347E81B5" wp14:editId="7CFD0E7B">
-            <wp:extent cx="3600000" cy="1960094"/>
+            <wp:extent cx="3420000" cy="1862089"/>
             <wp:effectExtent l="0" t="0" r="0" b="0"/>
             <wp:docPr id="3" name="Рисунок 3"/>
             <wp:cNvGraphicFramePr>
@@ -5840,7 +5988,7 @@
                   <pic:blipFill rotWithShape="1">
                     <a:blip r:embed="rId19" cstate="print">
                       <a:extLst>
-                        <a:ext uri="{28A0092B-C50C-407E-A947-70E740481C1C}" cx="3600000" cy="1960094">
+                        <a:ext uri="{28A0092B-C50C-407E-A947-70E740481C1C}" cx="3420000" cy="1862089">
                           <a14:useLocalDpi xmlns:a14="http://schemas.microsoft.com/office/drawing/2010/main" val="0"/>
                         </a:ext>
                       </a:extLst>
@@ -5852,7 +6000,7 @@
                   <pic:spPr bwMode="auto">
                     <a:xfrm>
                       <a:off x="0" y="0"/>
-                      <a:ext cx="3600000" cy="1960094"/>
+                      <a:ext cx="3420000" cy="1862089"/>
                     </a:xfrm>
                     <a:prstGeom prst="rect">
                       <a:avLst/>
@@ -5861,7 +6009,7 @@
                       <a:noFill/>
                     </a:ln>
                     <a:extLst>
-                      <a:ext uri="{53640926-AAD7-44D8-BBD7-CCE9431645EC}" cx="3600000" cy="1960094">
+                      <a:ext uri="{53640926-AAD7-44D8-BBD7-CCE9431645EC}" cx="3420000" cy="1862089">
                         <a14:shadowObscured xmlns:a14="http://schemas.microsoft.com/office/drawing/2010/main"/>
                       </a:ext>
                     </a:extLst>
@@ -5896,7 +6044,7 @@
         </w:rPr>
         <w:drawing>
           <wp:inline distT="0" distB="0" distL="0" distR="0" wp14:anchorId="2BE27D7F" wp14:editId="14BB8933">
-            <wp:extent cx="3600000" cy="2160000"/>
+            <wp:extent cx="3420000" cy="2052000"/>
             <wp:effectExtent l="0" t="0" r="8890" b="0"/>
             <wp:docPr id="1292032532" name="Рисунок 1"/>
             <wp:cNvGraphicFramePr>
@@ -5918,7 +6066,7 @@
                   <pic:spPr>
                     <a:xfrm>
                       <a:off x="0" y="0"/>
-                      <a:ext cx="3600000" cy="2160000"/>
+                      <a:ext cx="3420000" cy="2052000"/>
                     </a:xfrm>
                     <a:prstGeom prst="rect">
                       <a:avLst/>
@@ -5953,154 +6101,6 @@
           <w:szCs w:val="2"/>
         </w:rPr>
       </w:pPr>
-    </w:p>
-    <w:p>
-      <w:pPr>
-        <w:pStyle w:val="p1a"/>
-      </w:pPr>
-      <w:r>
-        <w:t xml:space="preserve">PMM3 significantly outperforms OLS at </w:t>
-      </w:r>
-      <m:oMath>
-        <m:r>
-          <w:rPr>
-            <w:rFonts w:ascii="Cambria Math" w:hAnsi="Cambria Math"/>
-          </w:rPr>
-          <m:t>λ≥1.5</m:t>
-        </m:r>
-      </m:oMath>
-      <w:r>
-        <w:t xml:space="preserve">: ARE ranging from 1.5 to 23.8 – the theory has been confirmed. MLE-TN is even more effective than PMM3 for </w:t>
-      </w:r>
-      <m:oMath>
-        <m:r>
-          <w:rPr>
-            <w:rFonts w:ascii="Cambria Math" w:hAnsi="Cambria Math"/>
-          </w:rPr>
-          <m:t>λ≥1.5</m:t>
-        </m:r>
-      </m:oMath>
-      <w:r>
-        <w:t xml:space="preserve"> (assuming the TN specification is correct), but it estimates </w:t>
-      </w:r>
-      <m:oMath>
-        <m:r>
-          <w:rPr>
-            <w:rFonts w:ascii="Cambria Math" w:hAnsi="Cambria Math"/>
-          </w:rPr>
-          <m:t>p+2</m:t>
-        </m:r>
-      </m:oMath>
-      <w:r>
-        <w:t xml:space="preserve"> parameters – excessive parameterization for small n. The empirical efficiency coefficient </w:t>
-      </w:r>
-      <m:oMath>
-        <m:sSub>
-          <m:sSubPr>
-            <m:ctrlPr>
-              <w:rPr>
-                <w:rFonts w:ascii="Cambria Math" w:hAnsi="Cambria Math"/>
-                <w:i/>
-              </w:rPr>
-            </m:ctrlPr>
-          </m:sSubPr>
-          <m:e>
-            <m:r>
-              <w:rPr>
-                <w:rFonts w:ascii="Cambria Math" w:hAnsi="Cambria Math"/>
-              </w:rPr>
-              <m:t>g</m:t>
-            </m:r>
-          </m:e>
-          <m:sub>
-            <m:r>
-              <w:rPr>
-                <w:rFonts w:ascii="Cambria Math" w:hAnsi="Cambria Math"/>
-              </w:rPr>
-              <m:t>3</m:t>
-            </m:r>
-          </m:sub>
-        </m:sSub>
-        <m:r>
-          <w:rPr>
-            <w:rFonts w:ascii="Cambria Math" w:hAnsi="Cambria Math"/>
-          </w:rPr>
-          <m:t>_emp</m:t>
-        </m:r>
-      </m:oMath>
-      <w:r>
-        <w:t xml:space="preserve"> approximates its theoretical value </w:t>
-      </w:r>
-      <m:oMath>
-        <m:sSub>
-          <m:sSubPr>
-            <m:ctrlPr>
-              <w:rPr>
-                <w:rFonts w:ascii="Cambria Math" w:hAnsi="Cambria Math"/>
-                <w:i/>
-              </w:rPr>
-            </m:ctrlPr>
-          </m:sSubPr>
-          <m:e>
-            <m:r>
-              <w:rPr>
-                <w:rFonts w:ascii="Cambria Math" w:hAnsi="Cambria Math"/>
-              </w:rPr>
-              <m:t>g</m:t>
-            </m:r>
-          </m:e>
-          <m:sub>
-            <m:r>
-              <w:rPr>
-                <w:rFonts w:ascii="Cambria Math" w:hAnsi="Cambria Math"/>
-              </w:rPr>
-              <m:t>3</m:t>
-            </m:r>
-          </m:sub>
-        </m:sSub>
-        <m:r>
-          <w:rPr>
-            <w:rFonts w:ascii="Cambria Math" w:hAnsi="Cambria Math"/>
-          </w:rPr>
-          <m:t>_theor</m:t>
-        </m:r>
-      </m:oMath>
-      <w:r>
-        <w:t xml:space="preserve"> with an accuracy of approximately ±10% for sufficient sample sizes (</w:t>
-      </w:r>
-      <m:oMath>
-        <m:r>
-          <w:rPr>
-            <w:rFonts w:ascii="Cambria Math" w:hAnsi="Cambria Math"/>
-          </w:rPr>
-          <m:t>n≥100</m:t>
-        </m:r>
-      </m:oMath>
-      <w:r>
-        <w:t xml:space="preserve">). For the most challenging scenario, </w:t>
-      </w:r>
-      <m:oMath>
-        <m:r>
-          <w:rPr>
-            <w:rFonts w:ascii="Cambria Math" w:eastAsia="Arial" w:hAnsi="Cambria Math"/>
-          </w:rPr>
-          <m:t>λ=5</m:t>
-        </m:r>
-      </m:oMath>
-      <w:r>
-        <w:t xml:space="preserve">, </w:t>
-      </w:r>
-      <m:oMath>
-        <m:r>
-          <w:rPr>
-            <w:rFonts w:ascii="Cambria Math" w:hAnsi="Cambria Math"/>
-          </w:rPr>
-          <m:t>n=100</m:t>
-        </m:r>
-      </m:oMath>
-      <w:r>
-        <w:t xml:space="preserve">, the efficiencies were ARE(PMM3) = 23.8 compared with ARE(MLE-TN) = 27.4. Thus, PMM3 lags behind MLE-TN by only about 15%, while requiring no prior knowledge of the underlying error distribution.</w:t>
-      </w:r>
     </w:p>
     <w:p>
       <w:pPr>
@@ -7301,18 +7301,15 @@
       </w:r>
     </w:p>
     <w:p>
-      <w:pPr>
-        <w:pStyle w:val="3"/>
+      <w:r>
         <w:rPr>
-          <w:rFonts w:eastAsia="Arial"/>
+          <w:b/>
+          <w:bCs/>
         </w:rPr>
-      </w:pPr>
-      <w:r>
-        <w:rPr>
-          <w:rFonts w:eastAsia="Arial"/>
-          <w:b/>
-        </w:rPr>
-        <w:t xml:space="preserve">Negative example. For the whiteside dataset (MASS package, household gas consumption versus outdoor temperature, n = 56) the residuals give γ₄ = −0.431, i.e. above the threshold: the theoretical gain is only 8.0% (g₃ theor = 0.920), the bootstrap ratio is g₃ emp = 0.978 and LOO-MSE PMM3/OLS = 0.999. Five further datasets with γ₄ ∈ [−0.54, −0.12] give g₃ emp ∈ [1.03, 1.36] and LOO-MSE PMM3/OLS ≤ 1.013, i.e. no gain, which supports the threshold γ₄ ≲ −0.7.</w:t>
+        <w:t xml:space="preserve">Negative example. </w:t>
+      </w:r>
+      <w:r>
+        <w:t xml:space="preserve">For the whiteside dataset (MASS package, household gas consumption versus outdoor temperature, n = 56) the residuals give γ₄ = −0.431, i.e. above the threshold: the theoretical gain is only 8.0% (g₃ theor = 0.920), the bootstrap ratio is g₃ emp = 0.978 and LOO-MSE PMM3/OLS = 0.999. Five further datasets with γ₄ ∈ [−0.54, −0.12] give g₃ emp ∈ [1.03, 1.36] and LOO-MSE PMM3/OLS ≤ 1.013, i.e. no gain, which supports the threshold γ₄ ≲ −0.7.</w:t>
       </w:r>
     </w:p>
     <w:p>
@@ -7849,7 +7846,7 @@
         </w:rPr>
       </w:pPr>
       <w:r>
-        <w:t xml:space="preserve">PMM3 is robust: ARE ≥ 1.02 for all four distributions, so it performs no worse than OLS even when its assumptions fail; for the uniform law (γ₄ = −1.2) it reaches 2.685, above MLE-TN (1.655). MLE-TN is considerably more sensitive to model misspecification. For example, under the triangular distribution, ARE = 0.969 indicating performance that is actually inferior to OLS. Therefore, PMM3 should be regarded as the safer estimation method whenever the true error distribution is uncertain. The Newton–Raphson implementation converged in 100% of the 200 replications with no NA outcomes for every λ ∈ {0.8, 1.0, 1.2, 1.5, 2.0, 3.0}, including the strongly bimodal cases, in 2.8–3.7 iterations on average, with absolute bias below 0.003.</w:t>
+        <w:t xml:space="preserve">PMM3 is robust: ARE ≥ 1.02 for all four distributions, so it performs no worse than OLS even when its assumptions fail; for the uniform law (γ₄ = −1.2) it reaches 2.685, above MLE-TN (1.655). MLE-TN is considerably more sensitive to misspecification: under the triangular law its ARE = 0.969 is below OLS. The Newton–Raphson implementation converged in 100% of the 200 replications with no NA outcomes for every λ ∈ {0.8, 1.0, 1.2, 1.5, 2.0, 3.0}, including the strongly bimodal cases, in 2.8–3.7 iterations on average, with absolute bias below 0.003.</w:t>
       </w:r>
     </w:p>
     <w:p>
@@ -8081,6 +8078,22 @@
       </m:oMath>
       <w:r>
         <w:t xml:space="preserve"> &lt; 0 no method offers a practical advantage over OLS (prediction error within 2% of OLS). In practice: prefer MLE-TN when the TN model is justified and n is large, PMM3 when the error distribution is uncertain, and OLS for approximately Gaussian errors.</w:t>
+      </w:r>
+    </w:p>
+    <w:p>
+      <w:pPr>
+        <w:pStyle w:val="p1a"/>
+        <w:spacing w:before="120"/>
+      </w:pPr>
+      <w:r>
+        <w:rPr>
+          <w:b/>
+          <w:bCs/>
+        </w:rPr>
+        <w:t xml:space="preserve">Data and Code Availability. </w:t>
+      </w:r>
+      <w:r>
+        <w:t xml:space="preserve">The R code of the study, the stored results of all experiments and a script that reruns the simulation and checks it against the stored tables are openly available under the MIT licence at https://github.com/SZabolotnii/Ku-PMM3-MLE-TN-code-supplement and archived on Zenodo: https://doi.org/10.5281/zenodo.22849684.</w:t>
       </w:r>
     </w:p>
     <w:p>

</xml_diff>